<commit_message>
chore: update template 09
</commit_message>
<xml_diff>
--- a/webapp/templates/TOTRINH/09_Mau_Giay_uy_quyen.docx
+++ b/webapp/templates/TOTRINH/09_Mau_Giay_uy_quyen.docx
@@ -1,29 +1,23 @@
 
 <file path=word/document.xml><?xml version="1.0" encoding="utf-8"?>
-<w:document xmlns:wpc="http://schemas.microsoft.com/office/word/2010/wordprocessingCanvas" xmlns:cx="http://schemas.microsoft.com/office/drawing/2014/chartex" xmlns:cx1="http://schemas.microsoft.com/office/drawing/2015/9/8/chartex" xmlns:cx2="http://schemas.microsoft.com/office/drawing/2015/10/21/chartex" xmlns:cx3="http://schemas.microsoft.com/office/drawing/2016/5/9/chartex" xmlns:cx4="http://schemas.microsoft.com/office/drawing/2016/5/10/chartex" xmlns:cx5="http://schemas.microsoft.com/office/drawing/2016/5/11/chartex" xmlns:cx6="http://schemas.microsoft.com/office/drawing/2016/5/12/chartex" xmlns:cx7="http://schemas.microsoft.com/office/drawing/2016/5/13/chartex" xmlns:cx8="http://schemas.microsoft.com/office/drawing/2016/5/14/chartex" xmlns:mc="http://schemas.openxmlformats.org/markup-compatibility/2006" xmlns:aink="http://schemas.microsoft.com/office/drawing/2016/ink" xmlns:am3d="http://schemas.microsoft.com/office/drawing/2017/model3d" xmlns:o="urn:schemas-microsoft-com:office:office" xmlns:oel="http://schemas.microsoft.com/office/2019/extlst" xmlns:r="http://schemas.openxmlformats.org/officeDocument/2006/relationships" xmlns:m="http://schemas.openxmlformats.org/officeDocument/2006/math" xmlns:v="urn:schemas-microsoft-com:vml" xmlns:wp14="http://schemas.microsoft.com/office/word/2010/wordprocessingDrawing" xmlns:wp="http://schemas.openxmlformats.org/drawingml/2006/wordprocessingDrawing" xmlns:w10="urn:schemas-microsoft-com:office:word" xmlns:w="http://schemas.openxmlformats.org/wordprocessingml/2006/main" xmlns:w14="http://schemas.microsoft.com/office/word/2010/wordml" xmlns:w15="http://schemas.microsoft.com/office/word/2012/wordml" xmlns:w16cex="http://schemas.microsoft.com/office/word/2018/wordml/cex" xmlns:w16cid="http://schemas.microsoft.com/office/word/2016/wordml/cid" xmlns:w16="http://schemas.microsoft.com/office/word/2018/wordml" xmlns:w16du="http://schemas.microsoft.com/office/word/2023/wordml/word16du" xmlns:w16sdtdh="http://schemas.microsoft.com/office/word/2020/wordml/sdtdatahash" xmlns:w16sdtfl="http://schemas.microsoft.com/office/word/2024/wordml/sdtformatlock" xmlns:w16se="http://schemas.microsoft.com/office/word/2015/wordml/symex" xmlns:wpg="http://schemas.microsoft.com/office/word/2010/wordprocessingGroup" xmlns:wpi="http://schemas.microsoft.com/office/word/2010/wordprocessingInk" xmlns:wne="http://schemas.microsoft.com/office/word/2006/wordml" xmlns:wps="http://schemas.microsoft.com/office/word/2010/wordprocessingShape" mc:Ignorable="w14 w15 w16se w16cid w16 w16cex w16sdtdh w16sdtfl w16du wp14">
+<w:document xmlns:wpc="http://schemas.microsoft.com/office/word/2010/wordprocessingCanvas" xmlns:cx="http://schemas.microsoft.com/office/drawing/2014/chartex" xmlns:cx1="http://schemas.microsoft.com/office/drawing/2015/9/8/chartex" xmlns:cx2="http://schemas.microsoft.com/office/drawing/2015/10/21/chartex" xmlns:cx3="http://schemas.microsoft.com/office/drawing/2016/5/9/chartex" xmlns:cx4="http://schemas.microsoft.com/office/drawing/2016/5/10/chartex" xmlns:cx5="http://schemas.microsoft.com/office/drawing/2016/5/11/chartex" xmlns:cx6="http://schemas.microsoft.com/office/drawing/2016/5/12/chartex" xmlns:cx7="http://schemas.microsoft.com/office/drawing/2016/5/13/chartex" xmlns:cx8="http://schemas.microsoft.com/office/drawing/2016/5/14/chartex" xmlns:mc="http://schemas.openxmlformats.org/markup-compatibility/2006" xmlns:aink="http://schemas.microsoft.com/office/drawing/2016/ink" xmlns:am3d="http://schemas.microsoft.com/office/drawing/2017/model3d" xmlns:o="urn:schemas-microsoft-com:office:office" xmlns:oel="http://schemas.microsoft.com/office/2019/extlst" xmlns:r="http://schemas.openxmlformats.org/officeDocument/2006/relationships" xmlns:m="http://schemas.openxmlformats.org/officeDocument/2006/math" xmlns:v="urn:schemas-microsoft-com:vml" xmlns:wp14="http://schemas.microsoft.com/office/word/2010/wordprocessingDrawing" xmlns:wp="http://schemas.openxmlformats.org/drawingml/2006/wordprocessingDrawing" xmlns:w10="urn:schemas-microsoft-com:office:word" xmlns:w="http://schemas.openxmlformats.org/wordprocessingml/2006/main" xmlns:w14="http://schemas.microsoft.com/office/word/2010/wordml" xmlns:w15="http://schemas.microsoft.com/office/word/2012/wordml" xmlns:w16cei="http://schemas.microsoft.com/office/word/2026/wordml/cei" xmlns:w16cex="http://schemas.microsoft.com/office/word/2018/wordml/cex" xmlns:w16cid="http://schemas.microsoft.com/office/word/2016/wordml/cid" xmlns:w16="http://schemas.microsoft.com/office/word/2018/wordml" xmlns:w16du="http://schemas.microsoft.com/office/word/2023/wordml/word16du" xmlns:w16sdtdh="http://schemas.microsoft.com/office/word/2020/wordml/sdtdatahash" xmlns:w16sdtfl="http://schemas.microsoft.com/office/word/2024/wordml/sdtformatlock" xmlns:w16se="http://schemas.microsoft.com/office/word/2015/wordml/symex" xmlns:wpg="http://schemas.microsoft.com/office/word/2010/wordprocessingGroup" xmlns:wpi="http://schemas.microsoft.com/office/word/2010/wordprocessingInk" xmlns:wne="http://schemas.microsoft.com/office/word/2006/wordml" xmlns:wps="http://schemas.microsoft.com/office/word/2010/wordprocessingShape" mc:Ignorable="w14 w15 w16se w16cid w16 w16cex w16sdtdh w16sdtfl w16du wp14">
   <w:body>
     <w:tbl>
       <w:tblPr>
         <w:tblW w:w="9435" w:type="dxa"/>
         <w:tblInd w:w="-113" w:type="dxa"/>
         <w:tblBorders>
-          <w:top w:val="single" w:sz="8" w:space="0" w:color="auto"/>
+          <w:bottom w:val="single" w:sz="8" w:space="0" w:color="auto"/>
         </w:tblBorders>
         <w:tblLayout w:type="fixed"/>
         <w:tblLook w:val="0000" w:firstRow="0" w:lastRow="0" w:firstColumn="0" w:lastColumn="0" w:noHBand="0" w:noVBand="0"/>
       </w:tblPr>
       <w:tblGrid>
-        <w:gridCol w:w="113"/>
-        <w:gridCol w:w="9287"/>
-        <w:gridCol w:w="35"/>
+        <w:gridCol w:w="3742"/>
+        <w:gridCol w:w="5670"/>
+        <w:gridCol w:w="23"/>
       </w:tblGrid>
       <w:tr>
-        <w:tblPrEx>
-          <w:tblBorders>
-            <w:top w:val="none" w:sz="0" w:space="0" w:color="auto"/>
-            <w:bottom w:val="single" w:sz="8" w:space="0" w:color="auto"/>
-          </w:tblBorders>
-        </w:tblPrEx>
         <w:trPr>
           <w:cantSplit/>
         </w:trPr>
@@ -41,76 +35,25 @@
               <w:rPr>
                 <w:rFonts w:ascii="Times New Roman" w:hAnsi="Times New Roman"/>
                 <w:b/>
+                <w:lang w:val="vi-VN"/>
               </w:rPr>
             </w:pPr>
-          </w:p>
-          <w:p>
-            <w:pPr>
-              <w:pStyle w:val="BodyTextIndent"/>
-              <w:spacing w:after="0"/>
-              <w:ind w:firstLine="0"/>
-              <w:jc w:val="left"/>
-              <w:rPr>
-                <w:rFonts w:ascii="Times New Roman" w:hAnsi="Times New Roman"/>
-                <w:b/>
-              </w:rPr>
-            </w:pPr>
-            <w:r>
-              <w:rPr>
-                <w:rFonts w:ascii="Times New Roman" w:hAnsi="Times New Roman"/>
-                <w:b/>
-              </w:rPr>
-              <w:t xml:space="preserve">Mẫu </w:t>
-            </w:r>
-            <w:r>
-              <w:rPr>
-                <w:rFonts w:ascii="Times New Roman" w:hAnsi="Times New Roman"/>
-                <w:b/>
-              </w:rPr>
-              <w:t>9</w:t>
-            </w:r>
-            <w:r>
-              <w:rPr>
-                <w:rFonts w:ascii="Times New Roman" w:hAnsi="Times New Roman"/>
-                <w:b/>
-              </w:rPr>
-              <w:t xml:space="preserve">. Giấy </w:t>
-            </w:r>
-            <w:r>
-              <w:rPr>
-                <w:rFonts w:ascii="Times New Roman" w:hAnsi="Times New Roman"/>
-                <w:b/>
-              </w:rPr>
-              <w:t>ủy</w:t>
-            </w:r>
-            <w:r>
-              <w:rPr>
-                <w:rFonts w:ascii="Times New Roman" w:hAnsi="Times New Roman"/>
-                <w:b/>
-              </w:rPr>
-              <w:t xml:space="preserve"> quyền</w:t>
-            </w:r>
           </w:p>
         </w:tc>
       </w:tr>
-    </w:tbl>
-    <w:tbl>
-      <w:tblPr>
-        <w:tblW w:w="0" w:type="auto"/>
-        <w:tblInd w:w="-113" w:type="dxa"/>
-        <w:tblLayout w:type="fixed"/>
-        <w:tblCellMar>
-          <w:left w:w="85" w:type="dxa"/>
-          <w:right w:w="85" w:type="dxa"/>
-        </w:tblCellMar>
-        <w:tblLook w:val="0000" w:firstRow="0" w:lastRow="0" w:firstColumn="0" w:lastColumn="0" w:noHBand="0" w:noVBand="0"/>
-      </w:tblPr>
-      <w:tblGrid>
-        <w:gridCol w:w="3742"/>
-        <w:gridCol w:w="5670"/>
-      </w:tblGrid>
       <w:tr>
+        <w:tblPrEx>
+          <w:tblBorders>
+            <w:bottom w:val="none" w:sz="0" w:space="0" w:color="auto"/>
+          </w:tblBorders>
+          <w:tblCellMar>
+            <w:left w:w="85" w:type="dxa"/>
+            <w:right w:w="85" w:type="dxa"/>
+          </w:tblCellMar>
+        </w:tblPrEx>
         <w:trPr>
+          <w:gridAfter w:val="1"/>
+          <w:wAfter w:w="23" w:type="dxa"/>
           <w:cantSplit/>
           <w:trHeight w:val="735"/>
         </w:trPr>
@@ -123,33 +66,23 @@
               <w:jc w:val="center"/>
               <w:rPr>
                 <w:rFonts w:ascii="Times New Roman" w:hAnsi="Times New Roman"/>
-                <w:sz w:val="26"/>
-                <w:szCs w:val="26"/>
+                <w:szCs w:val="28"/>
+                <w:lang w:val="vi-VN"/>
               </w:rPr>
             </w:pPr>
             <w:r>
               <w:rPr>
                 <w:rFonts w:ascii="Times New Roman" w:hAnsi="Times New Roman"/>
-                <w:sz w:val="26"/>
-                <w:szCs w:val="26"/>
-              </w:rPr>
-              <w:t xml:space="preserve">TẬP </w:t>
-            </w:r>
-            <w:r>
-              <w:rPr>
-                <w:rFonts w:ascii="Times New Roman" w:hAnsi="Times New Roman" w:hint="eastAsia"/>
-                <w:sz w:val="26"/>
-                <w:szCs w:val="26"/>
-              </w:rPr>
-              <w:t>Đ</w:t>
-            </w:r>
-            <w:r>
-              <w:rPr>
-                <w:rFonts w:ascii="Times New Roman" w:hAnsi="Times New Roman"/>
-                <w:sz w:val="26"/>
-                <w:szCs w:val="26"/>
-              </w:rPr>
-              <w:t xml:space="preserve">OÀN </w:t>
+                <w:szCs w:val="28"/>
+              </w:rPr>
+              <w:t xml:space="preserve">VIỄN THÔNG </w:t>
+            </w:r>
+            <w:r>
+              <w:rPr>
+                <w:rFonts w:ascii="Times New Roman" w:hAnsi="Times New Roman"/>
+                <w:szCs w:val="28"/>
+              </w:rPr>
+              <w:t>TÂY NINH</w:t>
             </w:r>
           </w:p>
           <w:p>
@@ -157,60 +90,6 @@
               <w:jc w:val="center"/>
               <w:rPr>
                 <w:rFonts w:ascii="Times New Roman" w:hAnsi="Times New Roman"/>
-                <w:sz w:val="26"/>
-                <w:szCs w:val="26"/>
-              </w:rPr>
-            </w:pPr>
-            <w:r>
-              <w:rPr>
-                <w:rFonts w:ascii="Times New Roman" w:hAnsi="Times New Roman"/>
-                <w:sz w:val="26"/>
-                <w:szCs w:val="26"/>
-              </w:rPr>
-              <w:t>B</w:t>
-            </w:r>
-            <w:r>
-              <w:rPr>
-                <w:rFonts w:ascii="Times New Roman" w:hAnsi="Times New Roman" w:hint="eastAsia"/>
-                <w:sz w:val="26"/>
-                <w:szCs w:val="26"/>
-              </w:rPr>
-              <w:t>Ư</w:t>
-            </w:r>
-            <w:r>
-              <w:rPr>
-                <w:rFonts w:ascii="Times New Roman" w:hAnsi="Times New Roman"/>
-                <w:sz w:val="26"/>
-                <w:szCs w:val="26"/>
-              </w:rPr>
-              <w:t xml:space="preserve">U CHÍNH VIỄN THÔNG VIỆT </w:t>
-            </w:r>
-            <w:smartTag w:uri="urn:schemas-microsoft-com:office:smarttags" w:element="place">
-              <w:smartTag w:uri="urn:schemas-microsoft-com:office:smarttags" w:element="country-region">
-                <w:r>
-                  <w:rPr>
-                    <w:rFonts w:ascii="Times New Roman" w:hAnsi="Times New Roman"/>
-                    <w:sz w:val="26"/>
-                    <w:szCs w:val="26"/>
-                  </w:rPr>
-                  <w:t>NAM</w:t>
-                </w:r>
-              </w:smartTag>
-            </w:smartTag>
-            <w:r>
-              <w:rPr>
-                <w:rFonts w:ascii="Times New Roman" w:hAnsi="Times New Roman"/>
-                <w:sz w:val="26"/>
-                <w:szCs w:val="26"/>
-              </w:rPr>
-              <w:t xml:space="preserve"> </w:t>
-            </w:r>
-          </w:p>
-          <w:p>
-            <w:pPr>
-              <w:jc w:val="center"/>
-              <w:rPr>
-                <w:rFonts w:ascii="Times New Roman" w:hAnsi="Times New Roman"/>
                 <w:b/>
                 <w:sz w:val="24"/>
                 <w:szCs w:val="24"/>
@@ -222,17 +101,9 @@
                 <w:b/>
                 <w:bCs/>
                 <w:szCs w:val="28"/>
-              </w:rPr>
-              <w:t xml:space="preserve">VIỄN THÔNG </w:t>
-            </w:r>
-            <w:r>
-              <w:rPr>
-                <w:rFonts w:ascii="Times New Roman" w:hAnsi="Times New Roman"/>
-                <w:b/>
-                <w:bCs/>
-                <w:szCs w:val="28"/>
-              </w:rPr>
-              <w:t>TÂY NINH</w:t>
+                <w:lang w:val="vi-VN"/>
+              </w:rPr>
+              <w:t xml:space="preserve">TRUNG TÂM HẠ TẦNG </w:t>
             </w:r>
             <w:r>
               <w:rPr>
@@ -356,8 +227,8 @@
               </w:rPr>
               <w:t xml:space="preserve">CỘNG HOÀ XÃ HỘI CHỦ NGHĨA VIỆT </w:t>
             </w:r>
-            <w:smartTag w:uri="urn:schemas-microsoft-com:office:smarttags" w:element="place">
-              <w:smartTag w:uri="urn:schemas-microsoft-com:office:smarttags" w:element="country-region">
+            <w:smartTag w:uri="urn:schemas-microsoft-com:office:smarttags" w:element="country-region">
+              <w:smartTag w:uri="urn:schemas-microsoft-com:office:smarttags" w:element="place">
                 <w:r>
                   <w:rPr>
                     <w:rFonts w:ascii="Times New Roman" w:hAnsi="Times New Roman"/>
@@ -378,6 +249,7 @@
                 <w:szCs w:val="28"/>
               </w:rPr>
             </w:pPr>
+            <w:proofErr w:type="spellStart"/>
             <w:r>
               <w:rPr>
                 <w:rFonts w:ascii="Times New Roman" w:hAnsi="Times New Roman" w:hint="eastAsia"/>
@@ -392,8 +264,81 @@
                 <w:b/>
                 <w:szCs w:val="28"/>
               </w:rPr>
-              <w:t>ộc lập - Tự do - Hạnh phúc</w:t>
-            </w:r>
+              <w:t>ộc</w:t>
+            </w:r>
+            <w:proofErr w:type="spellEnd"/>
+            <w:r>
+              <w:rPr>
+                <w:rFonts w:ascii="Times New Roman" w:hAnsi="Times New Roman"/>
+                <w:b/>
+                <w:szCs w:val="28"/>
+              </w:rPr>
+              <w:t xml:space="preserve"> </w:t>
+            </w:r>
+            <w:proofErr w:type="spellStart"/>
+            <w:r>
+              <w:rPr>
+                <w:rFonts w:ascii="Times New Roman" w:hAnsi="Times New Roman"/>
+                <w:b/>
+                <w:szCs w:val="28"/>
+              </w:rPr>
+              <w:t>lập</w:t>
+            </w:r>
+            <w:proofErr w:type="spellEnd"/>
+            <w:r>
+              <w:rPr>
+                <w:rFonts w:ascii="Times New Roman" w:hAnsi="Times New Roman"/>
+                <w:b/>
+                <w:szCs w:val="28"/>
+              </w:rPr>
+              <w:t xml:space="preserve"> - </w:t>
+            </w:r>
+            <w:proofErr w:type="spellStart"/>
+            <w:r>
+              <w:rPr>
+                <w:rFonts w:ascii="Times New Roman" w:hAnsi="Times New Roman"/>
+                <w:b/>
+                <w:szCs w:val="28"/>
+              </w:rPr>
+              <w:t>Tự</w:t>
+            </w:r>
+            <w:proofErr w:type="spellEnd"/>
+            <w:r>
+              <w:rPr>
+                <w:rFonts w:ascii="Times New Roman" w:hAnsi="Times New Roman"/>
+                <w:b/>
+                <w:szCs w:val="28"/>
+              </w:rPr>
+              <w:t xml:space="preserve"> do - </w:t>
+            </w:r>
+            <w:proofErr w:type="spellStart"/>
+            <w:r>
+              <w:rPr>
+                <w:rFonts w:ascii="Times New Roman" w:hAnsi="Times New Roman"/>
+                <w:b/>
+                <w:szCs w:val="28"/>
+              </w:rPr>
+              <w:t>Hạnh</w:t>
+            </w:r>
+            <w:proofErr w:type="spellEnd"/>
+            <w:r>
+              <w:rPr>
+                <w:rFonts w:ascii="Times New Roman" w:hAnsi="Times New Roman"/>
+                <w:b/>
+                <w:szCs w:val="28"/>
+              </w:rPr>
+              <w:t xml:space="preserve"> </w:t>
+            </w:r>
+            <w:proofErr w:type="spellStart"/>
+            <w:r>
+              <w:rPr>
+                <w:rFonts w:ascii="Times New Roman" w:hAnsi="Times New Roman"/>
+                <w:b/>
+                <w:szCs w:val="28"/>
+              </w:rPr>
+              <w:t>phúc</w:t>
+            </w:r>
+            <w:proofErr w:type="spellEnd"/>
           </w:p>
           <w:p>
             <w:pPr>
@@ -485,7 +430,18 @@
         </w:tc>
       </w:tr>
       <w:tr>
+        <w:tblPrEx>
+          <w:tblBorders>
+            <w:bottom w:val="none" w:sz="0" w:space="0" w:color="auto"/>
+          </w:tblBorders>
+          <w:tblCellMar>
+            <w:left w:w="85" w:type="dxa"/>
+            <w:right w:w="85" w:type="dxa"/>
+          </w:tblCellMar>
+        </w:tblPrEx>
         <w:trPr>
+          <w:gridAfter w:val="1"/>
+          <w:wAfter w:w="23" w:type="dxa"/>
           <w:cantSplit/>
         </w:trPr>
         <w:tc>
@@ -509,12 +465,21 @@
               </w:rPr>
               <w:t xml:space="preserve">    </w:t>
             </w:r>
-            <w:r>
-              <w:rPr>
-                <w:rFonts w:ascii="Times New Roman" w:hAnsi="Times New Roman"/>
-                <w:szCs w:val="28"/>
-              </w:rPr>
-              <w:t xml:space="preserve">Số:            </w:t>
+            <w:proofErr w:type="spellStart"/>
+            <w:r>
+              <w:rPr>
+                <w:rFonts w:ascii="Times New Roman" w:hAnsi="Times New Roman"/>
+                <w:szCs w:val="28"/>
+              </w:rPr>
+              <w:t>Số</w:t>
+            </w:r>
+            <w:proofErr w:type="spellEnd"/>
+            <w:r>
+              <w:rPr>
+                <w:rFonts w:ascii="Times New Roman" w:hAnsi="Times New Roman"/>
+                <w:szCs w:val="28"/>
+              </w:rPr>
+              <w:t xml:space="preserve">:            </w:t>
             </w:r>
           </w:p>
         </w:tc>
@@ -551,20 +516,48 @@
               </w:rPr>
               <w:t xml:space="preserve">, </w:t>
             </w:r>
+            <w:proofErr w:type="spellStart"/>
             <w:r>
               <w:rPr>
                 <w:rFonts w:ascii="Times New Roman" w:hAnsi="Times New Roman"/>
                 <w:i/>
                 <w:szCs w:val="28"/>
               </w:rPr>
-              <w:t xml:space="preserve">ngày        tháng    </w:t>
-            </w:r>
+              <w:t>ngày</w:t>
+            </w:r>
+            <w:proofErr w:type="spellEnd"/>
             <w:r>
               <w:rPr>
                 <w:rFonts w:ascii="Times New Roman" w:hAnsi="Times New Roman"/>
                 <w:i/>
                 <w:szCs w:val="28"/>
               </w:rPr>
+              <w:t xml:space="preserve">        </w:t>
+            </w:r>
+            <w:proofErr w:type="spellStart"/>
+            <w:r>
+              <w:rPr>
+                <w:rFonts w:ascii="Times New Roman" w:hAnsi="Times New Roman"/>
+                <w:i/>
+                <w:szCs w:val="28"/>
+              </w:rPr>
+              <w:t>tháng</w:t>
+            </w:r>
+            <w:proofErr w:type="spellEnd"/>
+            <w:r>
+              <w:rPr>
+                <w:rFonts w:ascii="Times New Roman" w:hAnsi="Times New Roman"/>
+                <w:i/>
+                <w:szCs w:val="28"/>
+              </w:rPr>
+              <w:t xml:space="preserve">    </w:t>
+            </w:r>
+            <w:r>
+              <w:rPr>
+                <w:rFonts w:ascii="Times New Roman" w:hAnsi="Times New Roman"/>
+                <w:i/>
+                <w:szCs w:val="28"/>
+              </w:rPr>
               <w:t xml:space="preserve"> </w:t>
             </w:r>
             <w:r>
@@ -573,7 +566,16 @@
                 <w:i/>
                 <w:szCs w:val="28"/>
               </w:rPr>
-              <w:t xml:space="preserve">  n</w:t>
+              <w:t xml:space="preserve">  </w:t>
+            </w:r>
+            <w:proofErr w:type="spellStart"/>
+            <w:r>
+              <w:rPr>
+                <w:rFonts w:ascii="Times New Roman" w:hAnsi="Times New Roman"/>
+                <w:i/>
+                <w:szCs w:val="28"/>
+              </w:rPr>
+              <w:t>n</w:t>
             </w:r>
             <w:r>
               <w:rPr>
@@ -589,7 +591,16 @@
                 <w:i/>
                 <w:szCs w:val="28"/>
               </w:rPr>
-              <w:t xml:space="preserve">m  </w:t>
+              <w:t>m</w:t>
+            </w:r>
+            <w:proofErr w:type="spellEnd"/>
+            <w:r>
+              <w:rPr>
+                <w:rFonts w:ascii="Times New Roman" w:hAnsi="Times New Roman"/>
+                <w:i/>
+                <w:szCs w:val="28"/>
+              </w:rPr>
+              <w:t xml:space="preserve">  </w:t>
             </w:r>
           </w:p>
         </w:tc>
@@ -802,17 +813,47 @@
         </w:rPr>
         <w:t xml:space="preserve">.................................. </w:t>
       </w:r>
+      <w:proofErr w:type="spellStart"/>
       <w:r>
         <w:rPr>
           <w:rFonts w:ascii="Times New Roman" w:hAnsi="Times New Roman"/>
         </w:rPr>
         <w:t>ủy</w:t>
       </w:r>
-      <w:r>
-        <w:rPr>
-          <w:rFonts w:ascii="Times New Roman" w:hAnsi="Times New Roman"/>
-        </w:rPr>
-        <w:t xml:space="preserve"> quyền cho:</w:t>
+      <w:proofErr w:type="spellEnd"/>
+      <w:r>
+        <w:rPr>
+          <w:rFonts w:ascii="Times New Roman" w:hAnsi="Times New Roman"/>
+        </w:rPr>
+        <w:t xml:space="preserve"> </w:t>
+      </w:r>
+      <w:proofErr w:type="spellStart"/>
+      <w:r>
+        <w:rPr>
+          <w:rFonts w:ascii="Times New Roman" w:hAnsi="Times New Roman"/>
+        </w:rPr>
+        <w:t>quyền</w:t>
+      </w:r>
+      <w:proofErr w:type="spellEnd"/>
+      <w:r>
+        <w:rPr>
+          <w:rFonts w:ascii="Times New Roman" w:hAnsi="Times New Roman"/>
+        </w:rPr>
+        <w:t xml:space="preserve"> </w:t>
+      </w:r>
+      <w:proofErr w:type="spellStart"/>
+      <w:r>
+        <w:rPr>
+          <w:rFonts w:ascii="Times New Roman" w:hAnsi="Times New Roman"/>
+        </w:rPr>
+        <w:t>cho</w:t>
+      </w:r>
+      <w:proofErr w:type="spellEnd"/>
+      <w:r>
+        <w:rPr>
+          <w:rFonts w:ascii="Times New Roman" w:hAnsi="Times New Roman"/>
+        </w:rPr>
+        <w:t>:</w:t>
       </w:r>
     </w:p>
     <w:p>
@@ -827,11 +868,33 @@
           <w:rFonts w:ascii="Times New Roman" w:hAnsi="Times New Roman"/>
         </w:rPr>
       </w:pPr>
-      <w:r>
-        <w:rPr>
-          <w:rFonts w:ascii="Times New Roman" w:hAnsi="Times New Roman"/>
-        </w:rPr>
-        <w:t>Ông (bà): ................................................</w:t>
+      <w:proofErr w:type="spellStart"/>
+      <w:r>
+        <w:rPr>
+          <w:rFonts w:ascii="Times New Roman" w:hAnsi="Times New Roman"/>
+        </w:rPr>
+        <w:t>Ông</w:t>
+      </w:r>
+      <w:proofErr w:type="spellEnd"/>
+      <w:r>
+        <w:rPr>
+          <w:rFonts w:ascii="Times New Roman" w:hAnsi="Times New Roman"/>
+        </w:rPr>
+        <w:t xml:space="preserve"> (</w:t>
+      </w:r>
+      <w:proofErr w:type="spellStart"/>
+      <w:r>
+        <w:rPr>
+          <w:rFonts w:ascii="Times New Roman" w:hAnsi="Times New Roman"/>
+        </w:rPr>
+        <w:t>bà</w:t>
+      </w:r>
+      <w:proofErr w:type="spellEnd"/>
+      <w:r>
+        <w:rPr>
+          <w:rFonts w:ascii="Times New Roman" w:hAnsi="Times New Roman"/>
+        </w:rPr>
+        <w:t>): ................................................</w:t>
       </w:r>
       <w:r>
         <w:rPr>
@@ -840,6 +903,7 @@
         </w:rPr>
         <w:t>(</w:t>
       </w:r>
+      <w:proofErr w:type="gramStart"/>
       <w:r>
         <w:rPr>
           <w:rFonts w:ascii="Times New Roman" w:hAnsi="Times New Roman"/>
@@ -872,6 +936,7 @@
         </w:rPr>
         <w:t>..........................................</w:t>
       </w:r>
+      <w:proofErr w:type="gramEnd"/>
     </w:p>
     <w:p>
       <w:pPr>
@@ -1005,22 +1070,16 @@
         <w:tblLook w:val="0000" w:firstRow="0" w:lastRow="0" w:firstColumn="0" w:lastColumn="0" w:noHBand="0" w:noVBand="0"/>
       </w:tblPr>
       <w:tblGrid>
-        <w:gridCol w:w="113"/>
-        <w:gridCol w:w="3646"/>
-        <w:gridCol w:w="5662"/>
+        <w:gridCol w:w="3690"/>
+        <w:gridCol w:w="5731"/>
       </w:tblGrid>
       <w:tr>
         <w:trPr>
-          <w:gridBefore w:val="1"/>
-          <w:wBefore w:w="113" w:type="dxa"/>
           <w:trHeight w:val="182"/>
         </w:trPr>
         <w:tc>
           <w:tcPr>
-            <w:tcW w:w="3646" w:type="dxa"/>
-            <w:tcBorders>
-              <w:bottom w:val="single" w:sz="4" w:space="0" w:color="auto"/>
-            </w:tcBorders>
+            <w:tcW w:w="3690" w:type="dxa"/>
           </w:tcPr>
           <w:p>
             <w:pPr>
@@ -1031,6 +1090,7 @@
                 <w:sz w:val="24"/>
               </w:rPr>
             </w:pPr>
+            <w:proofErr w:type="spellStart"/>
             <w:r>
               <w:rPr>
                 <w:rFonts w:ascii="Times New Roman" w:hAnsi="Times New Roman"/>
@@ -1056,7 +1116,37 @@
                 <w:i/>
                 <w:sz w:val="24"/>
               </w:rPr>
-              <w:t>i nhận:</w:t>
+              <w:t>i</w:t>
+            </w:r>
+            <w:proofErr w:type="spellEnd"/>
+            <w:r>
+              <w:rPr>
+                <w:rFonts w:ascii="Times New Roman" w:hAnsi="Times New Roman"/>
+                <w:b/>
+                <w:i/>
+                <w:sz w:val="24"/>
+              </w:rPr>
+              <w:t xml:space="preserve"> </w:t>
+            </w:r>
+            <w:proofErr w:type="spellStart"/>
+            <w:r>
+              <w:rPr>
+                <w:rFonts w:ascii="Times New Roman" w:hAnsi="Times New Roman"/>
+                <w:b/>
+                <w:i/>
+                <w:sz w:val="24"/>
+              </w:rPr>
+              <w:t>nhận</w:t>
+            </w:r>
+            <w:proofErr w:type="spellEnd"/>
+            <w:r>
+              <w:rPr>
+                <w:rFonts w:ascii="Times New Roman" w:hAnsi="Times New Roman"/>
+                <w:b/>
+                <w:i/>
+                <w:sz w:val="24"/>
+              </w:rPr>
+              <w:t>:</w:t>
             </w:r>
           </w:p>
           <w:p>
@@ -1115,8 +1205,17 @@
                 <w:rFonts w:ascii="Times New Roman" w:hAnsi="Times New Roman"/>
                 <w:sz w:val="22"/>
               </w:rPr>
-              <w:t>u: VT,...</w:t>
-            </w:r>
+              <w:t xml:space="preserve">u: </w:t>
+            </w:r>
+            <w:proofErr w:type="gramStart"/>
+            <w:r>
+              <w:rPr>
+                <w:rFonts w:ascii="Times New Roman" w:hAnsi="Times New Roman"/>
+                <w:sz w:val="22"/>
+              </w:rPr>
+              <w:t>VT,...</w:t>
+            </w:r>
+            <w:proofErr w:type="gramEnd"/>
             <w:r>
               <w:rPr>
                 <w:rFonts w:ascii="Times New Roman" w:hAnsi="Times New Roman"/>
@@ -1131,6 +1230,7 @@
               </w:rPr>
               <w:t>7</w:t>
             </w:r>
+            <w:proofErr w:type="gramStart"/>
             <w:r>
               <w:rPr>
                 <w:rFonts w:ascii="Times New Roman" w:hAnsi="Times New Roman"/>
@@ -1150,21 +1250,38 @@
                 <w:rFonts w:ascii="Times New Roman" w:hAnsi="Times New Roman"/>
                 <w:sz w:val="22"/>
               </w:rPr>
-              <w:t>.A.</w:t>
-            </w:r>
+              <w:t>.</w:t>
+            </w:r>
+            <w:proofErr w:type="gramEnd"/>
             <w:r>
               <w:rPr>
                 <w:rFonts w:ascii="Times New Roman" w:hAnsi="Times New Roman"/>
                 <w:sz w:val="22"/>
               </w:rPr>
+              <w:t>A.</w:t>
+            </w:r>
+            <w:r>
+              <w:rPr>
+                <w:rFonts w:ascii="Times New Roman" w:hAnsi="Times New Roman"/>
+                <w:sz w:val="22"/>
+              </w:rPr>
               <w:t xml:space="preserve"> </w:t>
             </w:r>
+            <w:proofErr w:type="gramStart"/>
             <w:r>
               <w:rPr>
                 <w:rFonts w:ascii="Times New Roman" w:hAnsi="Times New Roman"/>
                 <w:sz w:val="22"/>
               </w:rPr>
-              <w:t>XX(8)</w:t>
+              <w:t>XX(</w:t>
+            </w:r>
+            <w:proofErr w:type="gramEnd"/>
+            <w:r>
+              <w:rPr>
+                <w:rFonts w:ascii="Times New Roman" w:hAnsi="Times New Roman"/>
+                <w:sz w:val="22"/>
+              </w:rPr>
+              <w:t>8)</w:t>
             </w:r>
             <w:r>
               <w:rPr>
@@ -1189,6 +1306,7 @@
                 <w:sz w:val="22"/>
               </w:rPr>
             </w:pPr>
+            <w:proofErr w:type="spellStart"/>
             <w:r>
               <w:rPr>
                 <w:rFonts w:ascii="Times New Roman" w:hAnsi="Times New Roman"/>
@@ -1196,8 +1314,9 @@
                 <w:bCs/>
                 <w:sz w:val="24"/>
               </w:rPr>
-              <w:t>Số eOffice: ..(</w:t>
-            </w:r>
+              <w:t>Số</w:t>
+            </w:r>
+            <w:proofErr w:type="spellEnd"/>
             <w:r>
               <w:rPr>
                 <w:rFonts w:ascii="Times New Roman" w:hAnsi="Times New Roman"/>
@@ -1205,8 +1324,10 @@
                 <w:bCs/>
                 <w:sz w:val="24"/>
               </w:rPr>
-              <w:t>9</w:t>
-            </w:r>
+              <w:t xml:space="preserve"> </w:t>
+            </w:r>
+            <w:proofErr w:type="spellStart"/>
+            <w:proofErr w:type="gramStart"/>
             <w:r>
               <w:rPr>
                 <w:rFonts w:ascii="Times New Roman" w:hAnsi="Times New Roman"/>
@@ -1214,7 +1335,56 @@
                 <w:bCs/>
                 <w:sz w:val="24"/>
               </w:rPr>
-              <w:t>)..-</w:t>
+              <w:t>eOffice</w:t>
+            </w:r>
+            <w:proofErr w:type="spellEnd"/>
+            <w:r>
+              <w:rPr>
+                <w:rFonts w:ascii="Times New Roman" w:hAnsi="Times New Roman"/>
+                <w:b/>
+                <w:bCs/>
+                <w:sz w:val="24"/>
+              </w:rPr>
+              <w:t>: ..</w:t>
+            </w:r>
+            <w:proofErr w:type="gramEnd"/>
+            <w:r>
+              <w:rPr>
+                <w:rFonts w:ascii="Times New Roman" w:hAnsi="Times New Roman"/>
+                <w:b/>
+                <w:bCs/>
+                <w:sz w:val="24"/>
+              </w:rPr>
+              <w:t>(</w:t>
+            </w:r>
+            <w:r>
+              <w:rPr>
+                <w:rFonts w:ascii="Times New Roman" w:hAnsi="Times New Roman"/>
+                <w:b/>
+                <w:bCs/>
+                <w:sz w:val="24"/>
+              </w:rPr>
+              <w:t>9</w:t>
+            </w:r>
+            <w:proofErr w:type="gramStart"/>
+            <w:r>
+              <w:rPr>
+                <w:rFonts w:ascii="Times New Roman" w:hAnsi="Times New Roman"/>
+                <w:b/>
+                <w:bCs/>
+                <w:sz w:val="24"/>
+              </w:rPr>
+              <w:t>)..</w:t>
+            </w:r>
+            <w:proofErr w:type="gramEnd"/>
+            <w:r>
+              <w:rPr>
+                <w:rFonts w:ascii="Times New Roman" w:hAnsi="Times New Roman"/>
+                <w:b/>
+                <w:bCs/>
+                <w:sz w:val="24"/>
+              </w:rPr>
+              <w:t>-</w:t>
             </w:r>
             <w:r>
               <w:rPr>
@@ -1255,10 +1425,7 @@
         </w:tc>
         <w:tc>
           <w:tcPr>
-            <w:tcW w:w="5662" w:type="dxa"/>
-            <w:tcBorders>
-              <w:bottom w:val="single" w:sz="4" w:space="0" w:color="auto"/>
-            </w:tcBorders>
+            <w:tcW w:w="5731" w:type="dxa"/>
           </w:tcPr>
           <w:p>
             <w:pPr>
@@ -1366,7 +1533,71 @@
                 <w:rFonts w:ascii="Times New Roman" w:hAnsi="Times New Roman"/>
                 <w:i/>
               </w:rPr>
-              <w:t>(Chữ ký, đóng dấu)</w:t>
+              <w:t>(</w:t>
+            </w:r>
+            <w:proofErr w:type="spellStart"/>
+            <w:r>
+              <w:rPr>
+                <w:rFonts w:ascii="Times New Roman" w:hAnsi="Times New Roman"/>
+                <w:i/>
+              </w:rPr>
+              <w:t>Chữ</w:t>
+            </w:r>
+            <w:proofErr w:type="spellEnd"/>
+            <w:r>
+              <w:rPr>
+                <w:rFonts w:ascii="Times New Roman" w:hAnsi="Times New Roman"/>
+                <w:i/>
+              </w:rPr>
+              <w:t xml:space="preserve"> </w:t>
+            </w:r>
+            <w:proofErr w:type="spellStart"/>
+            <w:r>
+              <w:rPr>
+                <w:rFonts w:ascii="Times New Roman" w:hAnsi="Times New Roman"/>
+                <w:i/>
+              </w:rPr>
+              <w:t>ký</w:t>
+            </w:r>
+            <w:proofErr w:type="spellEnd"/>
+            <w:r>
+              <w:rPr>
+                <w:rFonts w:ascii="Times New Roman" w:hAnsi="Times New Roman"/>
+                <w:i/>
+              </w:rPr>
+              <w:t xml:space="preserve">, </w:t>
+            </w:r>
+            <w:proofErr w:type="spellStart"/>
+            <w:r>
+              <w:rPr>
+                <w:rFonts w:ascii="Times New Roman" w:hAnsi="Times New Roman"/>
+                <w:i/>
+              </w:rPr>
+              <w:t>đóng</w:t>
+            </w:r>
+            <w:proofErr w:type="spellEnd"/>
+            <w:r>
+              <w:rPr>
+                <w:rFonts w:ascii="Times New Roman" w:hAnsi="Times New Roman"/>
+                <w:i/>
+              </w:rPr>
+              <w:t xml:space="preserve"> </w:t>
+            </w:r>
+            <w:proofErr w:type="spellStart"/>
+            <w:r>
+              <w:rPr>
+                <w:rFonts w:ascii="Times New Roman" w:hAnsi="Times New Roman"/>
+                <w:i/>
+              </w:rPr>
+              <w:t>dấu</w:t>
+            </w:r>
+            <w:proofErr w:type="spellEnd"/>
+            <w:r>
+              <w:rPr>
+                <w:rFonts w:ascii="Times New Roman" w:hAnsi="Times New Roman"/>
+                <w:i/>
+              </w:rPr>
+              <w:t>)</w:t>
             </w:r>
           </w:p>
           <w:p>
@@ -1408,720 +1639,54 @@
                 <w:rFonts w:ascii="Times New Roman" w:hAnsi="Times New Roman"/>
               </w:rPr>
             </w:pPr>
-            <w:r>
-              <w:rPr>
-                <w:rFonts w:ascii="Times New Roman" w:hAnsi="Times New Roman"/>
-              </w:rPr>
-              <w:t>Họ Và Tên</w:t>
-            </w:r>
-          </w:p>
-        </w:tc>
-      </w:tr>
-      <w:tr>
-        <w:tblPrEx>
-          <w:tblBorders>
-            <w:top w:val="single" w:sz="8" w:space="0" w:color="auto"/>
-          </w:tblBorders>
-        </w:tblPrEx>
-        <w:trPr>
-          <w:gridBefore w:val="1"/>
-          <w:wBefore w:w="113" w:type="dxa"/>
-          <w:trHeight w:val="183"/>
-        </w:trPr>
-        <w:tc>
-          <w:tcPr>
-            <w:tcW w:w="9308" w:type="dxa"/>
-            <w:gridSpan w:val="2"/>
-            <w:tcBorders>
-              <w:top w:val="single" w:sz="4" w:space="0" w:color="auto"/>
-            </w:tcBorders>
-          </w:tcPr>
-          <w:p>
-            <w:pPr>
-              <w:rPr>
-                <w:rFonts w:ascii="Times New Roman" w:hAnsi="Times New Roman"/>
-                <w:b/>
-                <w:i/>
-                <w:sz w:val="22"/>
-              </w:rPr>
-            </w:pPr>
-            <w:r>
-              <w:rPr>
-                <w:rFonts w:ascii="Times New Roman" w:hAnsi="Times New Roman"/>
-                <w:b/>
-                <w:i/>
-                <w:sz w:val="22"/>
-              </w:rPr>
-              <w:t>Ghi chú:</w:t>
-            </w:r>
-          </w:p>
-          <w:p>
-            <w:pPr>
-              <w:rPr>
-                <w:rFonts w:ascii="Times New Roman" w:hAnsi="Times New Roman"/>
-                <w:b/>
-                <w:bCs/>
-                <w:i/>
-                <w:iCs/>
-                <w:sz w:val="22"/>
-                <w:szCs w:val="22"/>
-                <w:lang w:val="en-GB" w:eastAsia="zh-CN"/>
-              </w:rPr>
-            </w:pPr>
-            <w:r>
-              <w:rPr>
-                <w:rFonts w:ascii="Times New Roman" w:hAnsi="Times New Roman"/>
-                <w:b/>
-                <w:bCs/>
-                <w:i/>
-                <w:iCs/>
-                <w:sz w:val="22"/>
-                <w:szCs w:val="22"/>
-                <w:lang w:val="en-GB" w:eastAsia="zh-CN"/>
-              </w:rPr>
-              <w:t>* Các phần ghi: số: ký hiệu, ngày, tháng, năm của văn bản (để trống</w:t>
-            </w:r>
-            <w:r>
-              <w:rPr>
-                <w:rFonts w:ascii="Times New Roman" w:hAnsi="Times New Roman"/>
-                <w:b/>
-                <w:bCs/>
-                <w:i/>
-                <w:iCs/>
-                <w:sz w:val="22"/>
-                <w:szCs w:val="22"/>
-                <w:lang w:val="en-GB" w:eastAsia="zh-CN"/>
-              </w:rPr>
-              <w:t xml:space="preserve"> để hệ thống tự cập nhật</w:t>
-            </w:r>
-            <w:r>
-              <w:rPr>
-                <w:rFonts w:ascii="Times New Roman" w:hAnsi="Times New Roman"/>
-                <w:b/>
-                <w:bCs/>
-                <w:i/>
-                <w:iCs/>
-                <w:sz w:val="22"/>
-                <w:szCs w:val="22"/>
-                <w:lang w:val="en-GB" w:eastAsia="zh-CN"/>
-              </w:rPr>
-              <w:t>).</w:t>
-            </w:r>
-          </w:p>
-          <w:p>
-            <w:pPr>
-              <w:jc w:val="both"/>
-              <w:rPr>
-                <w:rFonts w:ascii="Times New Roman" w:hAnsi="Times New Roman"/>
-                <w:b/>
-                <w:bCs/>
-                <w:i/>
-                <w:iCs/>
-                <w:sz w:val="22"/>
-                <w:lang w:val="en-GB"/>
-              </w:rPr>
-            </w:pPr>
-            <w:r>
-              <w:rPr>
-                <w:rFonts w:ascii="Times New Roman" w:hAnsi="Times New Roman"/>
-                <w:b/>
-                <w:bCs/>
-                <w:i/>
-                <w:iCs/>
-                <w:sz w:val="22"/>
-                <w:szCs w:val="22"/>
-                <w:lang w:val="en-GB" w:eastAsia="zh-CN"/>
-              </w:rPr>
-              <w:t xml:space="preserve">* Phần đề ký: để khoảng cách (thông thủy) </w:t>
-            </w:r>
-            <w:r>
-              <w:rPr>
-                <w:rFonts w:ascii="Times New Roman" w:hAnsi="Times New Roman"/>
-                <w:b/>
-                <w:bCs/>
-                <w:i/>
-                <w:iCs/>
-                <w:sz w:val="22"/>
-                <w:lang w:val="en-GB"/>
-              </w:rPr>
-              <w:t>từ chân dòng ghi chức vụ bên trên đến dòng ghi họ và tên của người ký văn bản bên dưới từ 4,5cm đến 5 cm)</w:t>
-            </w:r>
-          </w:p>
-          <w:p>
-            <w:pPr>
-              <w:rPr>
-                <w:rFonts w:ascii="Times New Roman" w:hAnsi="Times New Roman"/>
-                <w:sz w:val="20"/>
-              </w:rPr>
-            </w:pPr>
-            <w:r>
-              <w:rPr>
-                <w:rFonts w:ascii="Times New Roman" w:hAnsi="Times New Roman"/>
-                <w:sz w:val="20"/>
-              </w:rPr>
-              <w:t xml:space="preserve">(1) Tên đơn vị ban hành văn bản (chữ in hoa, đứng, đậm) </w:t>
-            </w:r>
-          </w:p>
-          <w:p>
-            <w:pPr>
-              <w:rPr>
-                <w:rFonts w:ascii="Times New Roman" w:hAnsi="Times New Roman"/>
-                <w:sz w:val="20"/>
-              </w:rPr>
-            </w:pPr>
-            <w:r>
-              <w:rPr>
-                <w:rFonts w:ascii="Times New Roman" w:hAnsi="Times New Roman"/>
-                <w:sz w:val="20"/>
-              </w:rPr>
-              <w:t>(</w:t>
-            </w:r>
-            <w:r>
-              <w:rPr>
-                <w:rFonts w:ascii="Times New Roman" w:hAnsi="Times New Roman"/>
-                <w:sz w:val="20"/>
-              </w:rPr>
-              <w:t>2</w:t>
-            </w:r>
-            <w:r>
-              <w:rPr>
-                <w:rFonts w:ascii="Times New Roman" w:hAnsi="Times New Roman"/>
-                <w:sz w:val="20"/>
-              </w:rPr>
-              <w:t xml:space="preserve">) </w:t>
-            </w:r>
-            <w:r>
-              <w:rPr>
-                <w:rFonts w:ascii="Times New Roman" w:hAnsi="Times New Roman"/>
-                <w:sz w:val="20"/>
-              </w:rPr>
-              <w:t>Ghi đ</w:t>
-            </w:r>
-            <w:r>
-              <w:rPr>
-                <w:rFonts w:ascii="Times New Roman" w:hAnsi="Times New Roman"/>
-                <w:sz w:val="20"/>
-              </w:rPr>
-              <w:t>ịa danh.</w:t>
-            </w:r>
-          </w:p>
-          <w:p>
-            <w:pPr>
-              <w:rPr>
-                <w:rFonts w:ascii="Times New Roman" w:hAnsi="Times New Roman"/>
-                <w:sz w:val="20"/>
-              </w:rPr>
-            </w:pPr>
-            <w:r>
-              <w:rPr>
-                <w:rFonts w:ascii="Times New Roman" w:hAnsi="Times New Roman"/>
-                <w:sz w:val="20"/>
-              </w:rPr>
-              <w:t>(</w:t>
-            </w:r>
-            <w:r>
-              <w:rPr>
-                <w:rFonts w:ascii="Times New Roman" w:hAnsi="Times New Roman"/>
-                <w:sz w:val="20"/>
-              </w:rPr>
-              <w:t>3</w:t>
-            </w:r>
-            <w:r>
-              <w:rPr>
-                <w:rFonts w:ascii="Times New Roman" w:hAnsi="Times New Roman"/>
-                <w:sz w:val="20"/>
-              </w:rPr>
-              <w:t xml:space="preserve">) Ghi </w:t>
-            </w:r>
-            <w:r>
-              <w:rPr>
-                <w:rFonts w:ascii="Times New Roman" w:hAnsi="Times New Roman"/>
-                <w:sz w:val="20"/>
-              </w:rPr>
-              <w:t xml:space="preserve">rõ họ và tên, </w:t>
-            </w:r>
-            <w:r>
-              <w:rPr>
-                <w:rFonts w:ascii="Times New Roman" w:hAnsi="Times New Roman"/>
-                <w:sz w:val="20"/>
-              </w:rPr>
-              <w:t xml:space="preserve">chức </w:t>
-            </w:r>
-            <w:r>
-              <w:rPr>
-                <w:rFonts w:ascii="Times New Roman" w:hAnsi="Times New Roman"/>
-                <w:sz w:val="20"/>
-              </w:rPr>
-              <w:t>vụ, đơn vị công tác và giấy tờ tùy thân</w:t>
-            </w:r>
-            <w:r>
-              <w:rPr>
-                <w:rFonts w:ascii="Times New Roman" w:hAnsi="Times New Roman"/>
-                <w:sz w:val="20"/>
-              </w:rPr>
-              <w:t xml:space="preserve"> của ng</w:t>
-            </w:r>
-            <w:r>
-              <w:rPr>
-                <w:rFonts w:ascii="Times New Roman" w:hAnsi="Times New Roman" w:hint="eastAsia"/>
-                <w:sz w:val="20"/>
-              </w:rPr>
-              <w:t>ư</w:t>
-            </w:r>
-            <w:r>
-              <w:rPr>
-                <w:rFonts w:ascii="Times New Roman" w:hAnsi="Times New Roman"/>
-                <w:sz w:val="20"/>
-              </w:rPr>
-              <w:t xml:space="preserve">ời </w:t>
-            </w:r>
-            <w:r>
-              <w:rPr>
-                <w:rFonts w:ascii="Times New Roman" w:hAnsi="Times New Roman"/>
-                <w:sz w:val="20"/>
-              </w:rPr>
-              <w:t>ủy</w:t>
-            </w:r>
-            <w:r>
-              <w:rPr>
-                <w:rFonts w:ascii="Times New Roman" w:hAnsi="Times New Roman"/>
-                <w:sz w:val="20"/>
-              </w:rPr>
-              <w:t xml:space="preserve"> quyền.</w:t>
-            </w:r>
-          </w:p>
-          <w:p>
-            <w:pPr>
-              <w:rPr>
-                <w:rFonts w:ascii="Times New Roman" w:hAnsi="Times New Roman"/>
-                <w:sz w:val="20"/>
-              </w:rPr>
-            </w:pPr>
-            <w:r>
-              <w:rPr>
-                <w:rFonts w:ascii="Times New Roman" w:hAnsi="Times New Roman"/>
-                <w:sz w:val="20"/>
-              </w:rPr>
-              <w:t>(</w:t>
-            </w:r>
-            <w:r>
-              <w:rPr>
-                <w:rFonts w:ascii="Times New Roman" w:hAnsi="Times New Roman"/>
-                <w:sz w:val="20"/>
-              </w:rPr>
-              <w:t>4</w:t>
-            </w:r>
-            <w:r>
-              <w:rPr>
-                <w:rFonts w:ascii="Times New Roman" w:hAnsi="Times New Roman"/>
-                <w:sz w:val="20"/>
-              </w:rPr>
-              <w:t xml:space="preserve">) Ghi rõ họ và tên, chức vụ, </w:t>
-            </w:r>
-            <w:r>
-              <w:rPr>
-                <w:rFonts w:ascii="Times New Roman" w:hAnsi="Times New Roman" w:hint="eastAsia"/>
-                <w:sz w:val="20"/>
-              </w:rPr>
-              <w:t>đơ</w:t>
-            </w:r>
-            <w:r>
-              <w:rPr>
-                <w:rFonts w:ascii="Times New Roman" w:hAnsi="Times New Roman"/>
-                <w:sz w:val="20"/>
-              </w:rPr>
-              <w:t>n vị công tác và giấy tờ tuỳ thân của ng</w:t>
-            </w:r>
-            <w:r>
-              <w:rPr>
-                <w:rFonts w:ascii="Times New Roman" w:hAnsi="Times New Roman" w:hint="eastAsia"/>
-                <w:sz w:val="20"/>
-              </w:rPr>
-              <w:t>ư</w:t>
-            </w:r>
-            <w:r>
-              <w:rPr>
-                <w:rFonts w:ascii="Times New Roman" w:hAnsi="Times New Roman"/>
-                <w:sz w:val="20"/>
-              </w:rPr>
-              <w:t xml:space="preserve">ời </w:t>
-            </w:r>
-            <w:r>
-              <w:rPr>
-                <w:rFonts w:ascii="Times New Roman" w:hAnsi="Times New Roman" w:hint="eastAsia"/>
-                <w:sz w:val="20"/>
-              </w:rPr>
-              <w:t>đư</w:t>
-            </w:r>
-            <w:r>
-              <w:rPr>
-                <w:rFonts w:ascii="Times New Roman" w:hAnsi="Times New Roman"/>
-                <w:sz w:val="20"/>
-              </w:rPr>
-              <w:t xml:space="preserve">ợc </w:t>
-            </w:r>
-            <w:r>
-              <w:rPr>
-                <w:rFonts w:ascii="Times New Roman" w:hAnsi="Times New Roman"/>
-                <w:sz w:val="20"/>
-              </w:rPr>
-              <w:t>ủy</w:t>
-            </w:r>
-            <w:r>
-              <w:rPr>
-                <w:rFonts w:ascii="Times New Roman" w:hAnsi="Times New Roman"/>
-                <w:sz w:val="20"/>
-              </w:rPr>
-              <w:t xml:space="preserve"> quyền.</w:t>
-            </w:r>
-          </w:p>
-          <w:p>
-            <w:pPr>
-              <w:rPr>
-                <w:rFonts w:ascii="Times New Roman" w:hAnsi="Times New Roman"/>
-                <w:sz w:val="20"/>
-              </w:rPr>
-            </w:pPr>
-            <w:r>
-              <w:rPr>
-                <w:rFonts w:ascii="Times New Roman" w:hAnsi="Times New Roman"/>
-                <w:sz w:val="20"/>
-              </w:rPr>
-              <w:t>(</w:t>
-            </w:r>
-            <w:r>
-              <w:rPr>
-                <w:rFonts w:ascii="Times New Roman" w:hAnsi="Times New Roman"/>
-                <w:sz w:val="20"/>
-              </w:rPr>
-              <w:t>5</w:t>
-            </w:r>
-            <w:r>
-              <w:rPr>
-                <w:rFonts w:ascii="Times New Roman" w:hAnsi="Times New Roman"/>
-                <w:sz w:val="20"/>
-              </w:rPr>
-              <w:t xml:space="preserve">) Nội dung </w:t>
-            </w:r>
-            <w:r>
-              <w:rPr>
-                <w:rFonts w:ascii="Times New Roman" w:hAnsi="Times New Roman"/>
-                <w:sz w:val="20"/>
-              </w:rPr>
-              <w:t>ủy</w:t>
-            </w:r>
-            <w:r>
-              <w:rPr>
-                <w:rFonts w:ascii="Times New Roman" w:hAnsi="Times New Roman"/>
-                <w:sz w:val="20"/>
-              </w:rPr>
-              <w:t xml:space="preserve"> quyền: xác </w:t>
-            </w:r>
-            <w:r>
-              <w:rPr>
-                <w:rFonts w:ascii="Times New Roman" w:hAnsi="Times New Roman" w:hint="eastAsia"/>
-                <w:sz w:val="20"/>
-              </w:rPr>
-              <w:t>đ</w:t>
-            </w:r>
-            <w:r>
-              <w:rPr>
-                <w:rFonts w:ascii="Times New Roman" w:hAnsi="Times New Roman"/>
-                <w:sz w:val="20"/>
-              </w:rPr>
-              <w:t xml:space="preserve">ịnh cụ thể vấn </w:t>
-            </w:r>
-            <w:r>
-              <w:rPr>
-                <w:rFonts w:ascii="Times New Roman" w:hAnsi="Times New Roman" w:hint="eastAsia"/>
-                <w:sz w:val="20"/>
-              </w:rPr>
-              <w:t>đ</w:t>
-            </w:r>
-            <w:r>
-              <w:rPr>
-                <w:rFonts w:ascii="Times New Roman" w:hAnsi="Times New Roman"/>
-                <w:sz w:val="20"/>
-              </w:rPr>
-              <w:t xml:space="preserve">ề, việc </w:t>
-            </w:r>
-            <w:r>
-              <w:rPr>
-                <w:rFonts w:ascii="Times New Roman" w:hAnsi="Times New Roman" w:hint="eastAsia"/>
-                <w:sz w:val="20"/>
-              </w:rPr>
-              <w:t>đư</w:t>
-            </w:r>
-            <w:r>
-              <w:rPr>
-                <w:rFonts w:ascii="Times New Roman" w:hAnsi="Times New Roman"/>
-                <w:sz w:val="20"/>
-              </w:rPr>
-              <w:t xml:space="preserve">ợc </w:t>
-            </w:r>
-            <w:r>
-              <w:rPr>
-                <w:rFonts w:ascii="Times New Roman" w:hAnsi="Times New Roman"/>
-                <w:sz w:val="20"/>
-              </w:rPr>
-              <w:t>ủy</w:t>
-            </w:r>
-            <w:r>
-              <w:rPr>
-                <w:rFonts w:ascii="Times New Roman" w:hAnsi="Times New Roman"/>
-                <w:sz w:val="20"/>
-              </w:rPr>
-              <w:t xml:space="preserve"> quyền và phạm vi quyền hạn,</w:t>
-            </w:r>
-            <w:r>
-              <w:rPr>
-                <w:rFonts w:ascii="Times New Roman" w:hAnsi="Times New Roman"/>
-                <w:sz w:val="20"/>
-              </w:rPr>
-              <w:t xml:space="preserve"> thời gian,</w:t>
-            </w:r>
-            <w:r>
-              <w:rPr>
-                <w:rFonts w:ascii="Times New Roman" w:hAnsi="Times New Roman"/>
-                <w:sz w:val="20"/>
-              </w:rPr>
-              <w:t xml:space="preserve"> trách nhiệm của ng</w:t>
-            </w:r>
-            <w:r>
-              <w:rPr>
-                <w:rFonts w:ascii="Times New Roman" w:hAnsi="Times New Roman" w:hint="eastAsia"/>
-                <w:sz w:val="20"/>
-              </w:rPr>
-              <w:t>ư</w:t>
-            </w:r>
-            <w:r>
-              <w:rPr>
-                <w:rFonts w:ascii="Times New Roman" w:hAnsi="Times New Roman"/>
-                <w:sz w:val="20"/>
-              </w:rPr>
-              <w:t xml:space="preserve">ời </w:t>
-            </w:r>
-            <w:r>
-              <w:rPr>
-                <w:rFonts w:ascii="Times New Roman" w:hAnsi="Times New Roman" w:hint="eastAsia"/>
-                <w:sz w:val="20"/>
-              </w:rPr>
-              <w:t>đư</w:t>
-            </w:r>
-            <w:r>
-              <w:rPr>
-                <w:rFonts w:ascii="Times New Roman" w:hAnsi="Times New Roman"/>
-                <w:sz w:val="20"/>
-              </w:rPr>
-              <w:t xml:space="preserve">ợc </w:t>
-            </w:r>
-            <w:r>
-              <w:rPr>
-                <w:rFonts w:ascii="Times New Roman" w:hAnsi="Times New Roman"/>
-                <w:sz w:val="20"/>
-              </w:rPr>
-              <w:t>ủy</w:t>
-            </w:r>
-            <w:r>
-              <w:rPr>
-                <w:rFonts w:ascii="Times New Roman" w:hAnsi="Times New Roman"/>
-                <w:sz w:val="20"/>
-              </w:rPr>
-              <w:t xml:space="preserve"> quyền.</w:t>
-            </w:r>
-          </w:p>
-          <w:p>
-            <w:pPr>
-              <w:rPr>
-                <w:rFonts w:ascii="Times New Roman" w:hAnsi="Times New Roman"/>
-                <w:sz w:val="20"/>
-              </w:rPr>
-            </w:pPr>
-            <w:r>
-              <w:rPr>
-                <w:rFonts w:ascii="Times New Roman" w:hAnsi="Times New Roman"/>
-                <w:sz w:val="20"/>
-              </w:rPr>
-              <w:t>(</w:t>
-            </w:r>
-            <w:r>
-              <w:rPr>
-                <w:rFonts w:ascii="Times New Roman" w:hAnsi="Times New Roman"/>
-                <w:sz w:val="20"/>
-              </w:rPr>
-              <w:t>6</w:t>
-            </w:r>
-            <w:r>
-              <w:rPr>
-                <w:rFonts w:ascii="Times New Roman" w:hAnsi="Times New Roman"/>
-                <w:sz w:val="20"/>
-              </w:rPr>
-              <w:t>) Quyền hạn, chức vụ của ng</w:t>
-            </w:r>
-            <w:r>
-              <w:rPr>
-                <w:rFonts w:ascii="Times New Roman" w:hAnsi="Times New Roman" w:hint="eastAsia"/>
-                <w:sz w:val="20"/>
-              </w:rPr>
-              <w:t>ư</w:t>
-            </w:r>
-            <w:r>
-              <w:rPr>
-                <w:rFonts w:ascii="Times New Roman" w:hAnsi="Times New Roman"/>
-                <w:sz w:val="20"/>
-              </w:rPr>
-              <w:t xml:space="preserve">ời </w:t>
-            </w:r>
-            <w:r>
-              <w:rPr>
-                <w:rFonts w:ascii="Times New Roman" w:hAnsi="Times New Roman"/>
-                <w:sz w:val="20"/>
-              </w:rPr>
-              <w:t>ủ</w:t>
-            </w:r>
-            <w:r>
-              <w:rPr>
-                <w:rFonts w:ascii="Times New Roman" w:hAnsi="Times New Roman"/>
-                <w:sz w:val="20"/>
-              </w:rPr>
-              <w:t>y quyền</w:t>
-            </w:r>
-            <w:r>
-              <w:rPr>
-                <w:rFonts w:ascii="Times New Roman" w:hAnsi="Times New Roman"/>
-                <w:sz w:val="20"/>
-              </w:rPr>
-              <w:t xml:space="preserve"> (chữ in hoa, đứng, đậm).</w:t>
-            </w:r>
-          </w:p>
-          <w:p>
-            <w:pPr>
-              <w:rPr>
-                <w:rFonts w:ascii="Times New Roman" w:hAnsi="Times New Roman"/>
-                <w:spacing w:val="-2"/>
-                <w:sz w:val="20"/>
-                <w:lang w:val="en-US"/>
-              </w:rPr>
-            </w:pPr>
-            <w:r>
-              <w:rPr>
-                <w:rFonts w:ascii="Times New Roman" w:hAnsi="Times New Roman"/>
-                <w:sz w:val="20"/>
-                <w:lang w:val="en-US"/>
-              </w:rPr>
-              <w:t>(</w:t>
-            </w:r>
-            <w:r>
-              <w:rPr>
-                <w:rFonts w:ascii="Times New Roman" w:hAnsi="Times New Roman"/>
-                <w:sz w:val="20"/>
-                <w:lang w:val="en-US"/>
-              </w:rPr>
-              <w:t>7</w:t>
-            </w:r>
-            <w:r>
-              <w:rPr>
-                <w:rFonts w:ascii="Times New Roman" w:hAnsi="Times New Roman"/>
-                <w:sz w:val="20"/>
-                <w:lang w:val="en-US"/>
-              </w:rPr>
-              <w:t xml:space="preserve">) </w:t>
-            </w:r>
-            <w:r>
-              <w:rPr>
-                <w:rFonts w:ascii="Times New Roman" w:hAnsi="Times New Roman"/>
-                <w:spacing w:val="-2"/>
-                <w:sz w:val="20"/>
-                <w:lang w:val="en-US"/>
-              </w:rPr>
-              <w:t xml:space="preserve">Chữ viết tắt tên </w:t>
-            </w:r>
-            <w:r>
-              <w:rPr>
-                <w:rFonts w:ascii="Times New Roman" w:hAnsi="Times New Roman" w:hint="eastAsia"/>
-                <w:spacing w:val="-2"/>
-                <w:sz w:val="20"/>
-                <w:lang w:val="en-US"/>
-              </w:rPr>
-              <w:t>đơ</w:t>
-            </w:r>
-            <w:r>
-              <w:rPr>
-                <w:rFonts w:ascii="Times New Roman" w:hAnsi="Times New Roman"/>
-                <w:spacing w:val="-2"/>
-                <w:sz w:val="20"/>
-                <w:lang w:val="en-US"/>
-              </w:rPr>
-              <w:t>n vị ban hành và số l</w:t>
-            </w:r>
-            <w:r>
-              <w:rPr>
-                <w:rFonts w:ascii="Times New Roman" w:hAnsi="Times New Roman" w:hint="eastAsia"/>
-                <w:spacing w:val="-2"/>
-                <w:sz w:val="20"/>
-                <w:lang w:val="en-US"/>
-              </w:rPr>
-              <w:t>ư</w:t>
-            </w:r>
-            <w:r>
-              <w:rPr>
-                <w:rFonts w:ascii="Times New Roman" w:hAnsi="Times New Roman"/>
-                <w:spacing w:val="-2"/>
-                <w:sz w:val="20"/>
-                <w:lang w:val="en-US"/>
-              </w:rPr>
-              <w:t>ợng bản phát hành.</w:t>
-            </w:r>
-          </w:p>
-          <w:p>
-            <w:pPr>
-              <w:rPr>
-                <w:rFonts w:ascii="Times New Roman" w:hAnsi="Times New Roman"/>
-                <w:spacing w:val="-2"/>
-                <w:sz w:val="20"/>
-                <w:lang w:val="en-US"/>
-              </w:rPr>
-            </w:pPr>
-            <w:r>
-              <w:rPr>
-                <w:rFonts w:ascii="Times New Roman" w:hAnsi="Times New Roman"/>
-                <w:spacing w:val="-2"/>
-                <w:sz w:val="20"/>
-                <w:lang w:val="en-US"/>
-              </w:rPr>
-              <w:t>(8) Chữ ký hiệu của người soạn thảo và số lượng bản phát hành</w:t>
-            </w:r>
-          </w:p>
-          <w:p>
-            <w:pPr>
-              <w:pStyle w:val="FootnoteText"/>
-              <w:jc w:val="both"/>
-            </w:pPr>
-            <w:r>
-              <w:t>(</w:t>
-            </w:r>
-            <w:r>
-              <w:t>9</w:t>
-            </w:r>
-            <w:r>
-              <w:t xml:space="preserve">) Ghi số </w:t>
-            </w:r>
-            <w:r>
-              <w:t>eOffice</w:t>
-            </w:r>
-            <w:r>
-              <w:t>.</w:t>
-            </w:r>
-          </w:p>
-          <w:p>
-            <w:pPr>
-              <w:pStyle w:val="FootnoteText"/>
-              <w:jc w:val="both"/>
-            </w:pPr>
+            <w:proofErr w:type="spellStart"/>
+            <w:r>
+              <w:rPr>
+                <w:rFonts w:ascii="Times New Roman" w:hAnsi="Times New Roman"/>
+              </w:rPr>
+              <w:t>Họ</w:t>
+            </w:r>
+            <w:proofErr w:type="spellEnd"/>
+            <w:r>
+              <w:rPr>
+                <w:rFonts w:ascii="Times New Roman" w:hAnsi="Times New Roman"/>
+              </w:rPr>
+              <w:t xml:space="preserve"> </w:t>
+            </w:r>
+            <w:proofErr w:type="spellStart"/>
+            <w:r>
+              <w:rPr>
+                <w:rFonts w:ascii="Times New Roman" w:hAnsi="Times New Roman"/>
+              </w:rPr>
+              <w:t>Và</w:t>
+            </w:r>
+            <w:proofErr w:type="spellEnd"/>
+            <w:r>
+              <w:rPr>
+                <w:rFonts w:ascii="Times New Roman" w:hAnsi="Times New Roman"/>
+              </w:rPr>
+              <w:t xml:space="preserve"> </w:t>
+            </w:r>
+            <w:proofErr w:type="spellStart"/>
+            <w:r>
+              <w:rPr>
+                <w:rFonts w:ascii="Times New Roman" w:hAnsi="Times New Roman"/>
+              </w:rPr>
+              <w:t>Tên</w:t>
+            </w:r>
+            <w:proofErr w:type="spellEnd"/>
           </w:p>
         </w:tc>
       </w:tr>
     </w:tbl>
+    <w:p>
+      <w:pPr>
+        <w:rPr>
+          <w:rFonts w:asciiTheme="minorHAnsi" w:hAnsiTheme="minorHAnsi"/>
+          <w:lang w:val="vi-VN"/>
+        </w:rPr>
+      </w:pPr>
+    </w:p>
     <w:sectPr>
       <w:headerReference w:type="default" r:id="rId7"/>
       <w:footerReference w:type="even" r:id="rId8"/>
@@ -2137,7 +1702,7 @@
 </file>
 
 <file path=word/endnotes.xml><?xml version="1.0" encoding="utf-8"?>
-<w:endnotes xmlns:wpc="http://schemas.microsoft.com/office/word/2010/wordprocessingCanvas" xmlns:cx="http://schemas.microsoft.com/office/drawing/2014/chartex" xmlns:cx1="http://schemas.microsoft.com/office/drawing/2015/9/8/chartex" xmlns:cx2="http://schemas.microsoft.com/office/drawing/2015/10/21/chartex" xmlns:cx3="http://schemas.microsoft.com/office/drawing/2016/5/9/chartex" xmlns:cx4="http://schemas.microsoft.com/office/drawing/2016/5/10/chartex" xmlns:cx5="http://schemas.microsoft.com/office/drawing/2016/5/11/chartex" xmlns:cx6="http://schemas.microsoft.com/office/drawing/2016/5/12/chartex" xmlns:cx7="http://schemas.microsoft.com/office/drawing/2016/5/13/chartex" xmlns:cx8="http://schemas.microsoft.com/office/drawing/2016/5/14/chartex" xmlns:mc="http://schemas.openxmlformats.org/markup-compatibility/2006" xmlns:aink="http://schemas.microsoft.com/office/drawing/2016/ink" xmlns:am3d="http://schemas.microsoft.com/office/drawing/2017/model3d" xmlns:o="urn:schemas-microsoft-com:office:office" xmlns:oel="http://schemas.microsoft.com/office/2019/extlst" xmlns:r="http://schemas.openxmlformats.org/officeDocument/2006/relationships" xmlns:m="http://schemas.openxmlformats.org/officeDocument/2006/math" xmlns:v="urn:schemas-microsoft-com:vml" xmlns:wp14="http://schemas.microsoft.com/office/word/2010/wordprocessingDrawing" xmlns:wp="http://schemas.openxmlformats.org/drawingml/2006/wordprocessingDrawing" xmlns:w10="urn:schemas-microsoft-com:office:word" xmlns:w="http://schemas.openxmlformats.org/wordprocessingml/2006/main" xmlns:w14="http://schemas.microsoft.com/office/word/2010/wordml" xmlns:w15="http://schemas.microsoft.com/office/word/2012/wordml" xmlns:w16cex="http://schemas.microsoft.com/office/word/2018/wordml/cex" xmlns:w16cid="http://schemas.microsoft.com/office/word/2016/wordml/cid" xmlns:w16="http://schemas.microsoft.com/office/word/2018/wordml" xmlns:w16du="http://schemas.microsoft.com/office/word/2023/wordml/word16du" xmlns:w16sdtdh="http://schemas.microsoft.com/office/word/2020/wordml/sdtdatahash" xmlns:w16sdtfl="http://schemas.microsoft.com/office/word/2024/wordml/sdtformatlock" xmlns:w16se="http://schemas.microsoft.com/office/word/2015/wordml/symex" xmlns:wpg="http://schemas.microsoft.com/office/word/2010/wordprocessingGroup" xmlns:wpi="http://schemas.microsoft.com/office/word/2010/wordprocessingInk" xmlns:wne="http://schemas.microsoft.com/office/word/2006/wordml" xmlns:wps="http://schemas.microsoft.com/office/word/2010/wordprocessingShape" mc:Ignorable="w14 w15 w16se w16cid w16 w16cex w16sdtdh w16sdtfl w16du wp14">
+<w:endnotes xmlns:wpc="http://schemas.microsoft.com/office/word/2010/wordprocessingCanvas" xmlns:cx="http://schemas.microsoft.com/office/drawing/2014/chartex" xmlns:cx1="http://schemas.microsoft.com/office/drawing/2015/9/8/chartex" xmlns:cx2="http://schemas.microsoft.com/office/drawing/2015/10/21/chartex" xmlns:cx3="http://schemas.microsoft.com/office/drawing/2016/5/9/chartex" xmlns:cx4="http://schemas.microsoft.com/office/drawing/2016/5/10/chartex" xmlns:cx5="http://schemas.microsoft.com/office/drawing/2016/5/11/chartex" xmlns:cx6="http://schemas.microsoft.com/office/drawing/2016/5/12/chartex" xmlns:cx7="http://schemas.microsoft.com/office/drawing/2016/5/13/chartex" xmlns:cx8="http://schemas.microsoft.com/office/drawing/2016/5/14/chartex" xmlns:mc="http://schemas.openxmlformats.org/markup-compatibility/2006" xmlns:aink="http://schemas.microsoft.com/office/drawing/2016/ink" xmlns:am3d="http://schemas.microsoft.com/office/drawing/2017/model3d" xmlns:o="urn:schemas-microsoft-com:office:office" xmlns:oel="http://schemas.microsoft.com/office/2019/extlst" xmlns:r="http://schemas.openxmlformats.org/officeDocument/2006/relationships" xmlns:m="http://schemas.openxmlformats.org/officeDocument/2006/math" xmlns:v="urn:schemas-microsoft-com:vml" xmlns:wp14="http://schemas.microsoft.com/office/word/2010/wordprocessingDrawing" xmlns:wp="http://schemas.openxmlformats.org/drawingml/2006/wordprocessingDrawing" xmlns:w10="urn:schemas-microsoft-com:office:word" xmlns:w="http://schemas.openxmlformats.org/wordprocessingml/2006/main" xmlns:w14="http://schemas.microsoft.com/office/word/2010/wordml" xmlns:w15="http://schemas.microsoft.com/office/word/2012/wordml" xmlns:w16cei="http://schemas.microsoft.com/office/word/2026/wordml/cei" xmlns:w16cex="http://schemas.microsoft.com/office/word/2018/wordml/cex" xmlns:w16cid="http://schemas.microsoft.com/office/word/2016/wordml/cid" xmlns:w16="http://schemas.microsoft.com/office/word/2018/wordml" xmlns:w16du="http://schemas.microsoft.com/office/word/2023/wordml/word16du" xmlns:w16sdtdh="http://schemas.microsoft.com/office/word/2020/wordml/sdtdatahash" xmlns:w16sdtfl="http://schemas.microsoft.com/office/word/2024/wordml/sdtformatlock" xmlns:w16se="http://schemas.microsoft.com/office/word/2015/wordml/symex" xmlns:wpg="http://schemas.microsoft.com/office/word/2010/wordprocessingGroup" xmlns:wpi="http://schemas.microsoft.com/office/word/2010/wordprocessingInk" xmlns:wne="http://schemas.microsoft.com/office/word/2006/wordml" xmlns:wps="http://schemas.microsoft.com/office/word/2010/wordprocessingShape" mc:Ignorable="w14 w15 w16se w16cid w16 w16cex w16sdtdh w16sdtfl w16du wp14">
   <w:endnote w:type="separator" w:id="-1">
     <w:p>
       <w:r>
@@ -2156,7 +1721,7 @@
 </file>
 
 <file path=word/footer1.xml><?xml version="1.0" encoding="utf-8"?>
-<w:ftr xmlns:wpc="http://schemas.microsoft.com/office/word/2010/wordprocessingCanvas" xmlns:cx="http://schemas.microsoft.com/office/drawing/2014/chartex" xmlns:cx1="http://schemas.microsoft.com/office/drawing/2015/9/8/chartex" xmlns:cx2="http://schemas.microsoft.com/office/drawing/2015/10/21/chartex" xmlns:cx3="http://schemas.microsoft.com/office/drawing/2016/5/9/chartex" xmlns:cx4="http://schemas.microsoft.com/office/drawing/2016/5/10/chartex" xmlns:cx5="http://schemas.microsoft.com/office/drawing/2016/5/11/chartex" xmlns:cx6="http://schemas.microsoft.com/office/drawing/2016/5/12/chartex" xmlns:cx7="http://schemas.microsoft.com/office/drawing/2016/5/13/chartex" xmlns:cx8="http://schemas.microsoft.com/office/drawing/2016/5/14/chartex" xmlns:mc="http://schemas.openxmlformats.org/markup-compatibility/2006" xmlns:aink="http://schemas.microsoft.com/office/drawing/2016/ink" xmlns:am3d="http://schemas.microsoft.com/office/drawing/2017/model3d" xmlns:o="urn:schemas-microsoft-com:office:office" xmlns:oel="http://schemas.microsoft.com/office/2019/extlst" xmlns:r="http://schemas.openxmlformats.org/officeDocument/2006/relationships" xmlns:m="http://schemas.openxmlformats.org/officeDocument/2006/math" xmlns:v="urn:schemas-microsoft-com:vml" xmlns:wp14="http://schemas.microsoft.com/office/word/2010/wordprocessingDrawing" xmlns:wp="http://schemas.openxmlformats.org/drawingml/2006/wordprocessingDrawing" xmlns:w10="urn:schemas-microsoft-com:office:word" xmlns:w="http://schemas.openxmlformats.org/wordprocessingml/2006/main" xmlns:w14="http://schemas.microsoft.com/office/word/2010/wordml" xmlns:w15="http://schemas.microsoft.com/office/word/2012/wordml" xmlns:w16cex="http://schemas.microsoft.com/office/word/2018/wordml/cex" xmlns:w16cid="http://schemas.microsoft.com/office/word/2016/wordml/cid" xmlns:w16="http://schemas.microsoft.com/office/word/2018/wordml" xmlns:w16du="http://schemas.microsoft.com/office/word/2023/wordml/word16du" xmlns:w16sdtdh="http://schemas.microsoft.com/office/word/2020/wordml/sdtdatahash" xmlns:w16sdtfl="http://schemas.microsoft.com/office/word/2024/wordml/sdtformatlock" xmlns:w16se="http://schemas.microsoft.com/office/word/2015/wordml/symex" xmlns:wpg="http://schemas.microsoft.com/office/word/2010/wordprocessingGroup" xmlns:wpi="http://schemas.microsoft.com/office/word/2010/wordprocessingInk" xmlns:wne="http://schemas.microsoft.com/office/word/2006/wordml" xmlns:wps="http://schemas.microsoft.com/office/word/2010/wordprocessingShape" mc:Ignorable="w14 w15 w16se w16cid w16 w16cex w16sdtdh w16sdtfl w16du wp14">
+<w:ftr xmlns:wpc="http://schemas.microsoft.com/office/word/2010/wordprocessingCanvas" xmlns:cx="http://schemas.microsoft.com/office/drawing/2014/chartex" xmlns:cx1="http://schemas.microsoft.com/office/drawing/2015/9/8/chartex" xmlns:cx2="http://schemas.microsoft.com/office/drawing/2015/10/21/chartex" xmlns:cx3="http://schemas.microsoft.com/office/drawing/2016/5/9/chartex" xmlns:cx4="http://schemas.microsoft.com/office/drawing/2016/5/10/chartex" xmlns:cx5="http://schemas.microsoft.com/office/drawing/2016/5/11/chartex" xmlns:cx6="http://schemas.microsoft.com/office/drawing/2016/5/12/chartex" xmlns:cx7="http://schemas.microsoft.com/office/drawing/2016/5/13/chartex" xmlns:cx8="http://schemas.microsoft.com/office/drawing/2016/5/14/chartex" xmlns:mc="http://schemas.openxmlformats.org/markup-compatibility/2006" xmlns:aink="http://schemas.microsoft.com/office/drawing/2016/ink" xmlns:am3d="http://schemas.microsoft.com/office/drawing/2017/model3d" xmlns:o="urn:schemas-microsoft-com:office:office" xmlns:oel="http://schemas.microsoft.com/office/2019/extlst" xmlns:r="http://schemas.openxmlformats.org/officeDocument/2006/relationships" xmlns:m="http://schemas.openxmlformats.org/officeDocument/2006/math" xmlns:v="urn:schemas-microsoft-com:vml" xmlns:wp14="http://schemas.microsoft.com/office/word/2010/wordprocessingDrawing" xmlns:wp="http://schemas.openxmlformats.org/drawingml/2006/wordprocessingDrawing" xmlns:w10="urn:schemas-microsoft-com:office:word" xmlns:w="http://schemas.openxmlformats.org/wordprocessingml/2006/main" xmlns:w14="http://schemas.microsoft.com/office/word/2010/wordml" xmlns:w15="http://schemas.microsoft.com/office/word/2012/wordml" xmlns:w16cei="http://schemas.microsoft.com/office/word/2026/wordml/cei" xmlns:w16cex="http://schemas.microsoft.com/office/word/2018/wordml/cex" xmlns:w16cid="http://schemas.microsoft.com/office/word/2016/wordml/cid" xmlns:w16="http://schemas.microsoft.com/office/word/2018/wordml" xmlns:w16du="http://schemas.microsoft.com/office/word/2023/wordml/word16du" xmlns:w16sdtdh="http://schemas.microsoft.com/office/word/2020/wordml/sdtdatahash" xmlns:w16sdtfl="http://schemas.microsoft.com/office/word/2024/wordml/sdtformatlock" xmlns:w16se="http://schemas.microsoft.com/office/word/2015/wordml/symex" xmlns:wpg="http://schemas.microsoft.com/office/word/2010/wordprocessingGroup" xmlns:wpi="http://schemas.microsoft.com/office/word/2010/wordprocessingInk" xmlns:wne="http://schemas.microsoft.com/office/word/2006/wordml" xmlns:wps="http://schemas.microsoft.com/office/word/2010/wordprocessingShape" mc:Ignorable="w14 w15 w16se w16cid w16 w16cex w16sdtdh w16sdtfl w16du wp14">
   <w:p>
     <w:pPr>
       <w:pStyle w:val="Footer"/>
@@ -2201,7 +1766,7 @@
 </file>
 
 <file path=word/footer2.xml><?xml version="1.0" encoding="utf-8"?>
-<w:ftr xmlns:wpc="http://schemas.microsoft.com/office/word/2010/wordprocessingCanvas" xmlns:cx="http://schemas.microsoft.com/office/drawing/2014/chartex" xmlns:cx1="http://schemas.microsoft.com/office/drawing/2015/9/8/chartex" xmlns:cx2="http://schemas.microsoft.com/office/drawing/2015/10/21/chartex" xmlns:cx3="http://schemas.microsoft.com/office/drawing/2016/5/9/chartex" xmlns:cx4="http://schemas.microsoft.com/office/drawing/2016/5/10/chartex" xmlns:cx5="http://schemas.microsoft.com/office/drawing/2016/5/11/chartex" xmlns:cx6="http://schemas.microsoft.com/office/drawing/2016/5/12/chartex" xmlns:cx7="http://schemas.microsoft.com/office/drawing/2016/5/13/chartex" xmlns:cx8="http://schemas.microsoft.com/office/drawing/2016/5/14/chartex" xmlns:mc="http://schemas.openxmlformats.org/markup-compatibility/2006" xmlns:aink="http://schemas.microsoft.com/office/drawing/2016/ink" xmlns:am3d="http://schemas.microsoft.com/office/drawing/2017/model3d" xmlns:o="urn:schemas-microsoft-com:office:office" xmlns:oel="http://schemas.microsoft.com/office/2019/extlst" xmlns:r="http://schemas.openxmlformats.org/officeDocument/2006/relationships" xmlns:m="http://schemas.openxmlformats.org/officeDocument/2006/math" xmlns:v="urn:schemas-microsoft-com:vml" xmlns:wp14="http://schemas.microsoft.com/office/word/2010/wordprocessingDrawing" xmlns:wp="http://schemas.openxmlformats.org/drawingml/2006/wordprocessingDrawing" xmlns:w10="urn:schemas-microsoft-com:office:word" xmlns:w="http://schemas.openxmlformats.org/wordprocessingml/2006/main" xmlns:w14="http://schemas.microsoft.com/office/word/2010/wordml" xmlns:w15="http://schemas.microsoft.com/office/word/2012/wordml" xmlns:w16cex="http://schemas.microsoft.com/office/word/2018/wordml/cex" xmlns:w16cid="http://schemas.microsoft.com/office/word/2016/wordml/cid" xmlns:w16="http://schemas.microsoft.com/office/word/2018/wordml" xmlns:w16du="http://schemas.microsoft.com/office/word/2023/wordml/word16du" xmlns:w16sdtdh="http://schemas.microsoft.com/office/word/2020/wordml/sdtdatahash" xmlns:w16sdtfl="http://schemas.microsoft.com/office/word/2024/wordml/sdtformatlock" xmlns:w16se="http://schemas.microsoft.com/office/word/2015/wordml/symex" xmlns:wpg="http://schemas.microsoft.com/office/word/2010/wordprocessingGroup" xmlns:wpi="http://schemas.microsoft.com/office/word/2010/wordprocessingInk" xmlns:wne="http://schemas.microsoft.com/office/word/2006/wordml" xmlns:wps="http://schemas.microsoft.com/office/word/2010/wordprocessingShape" mc:Ignorable="w14 w15 w16se w16cid w16 w16cex w16sdtdh w16sdtfl w16du wp14">
+<w:ftr xmlns:wpc="http://schemas.microsoft.com/office/word/2010/wordprocessingCanvas" xmlns:cx="http://schemas.microsoft.com/office/drawing/2014/chartex" xmlns:cx1="http://schemas.microsoft.com/office/drawing/2015/9/8/chartex" xmlns:cx2="http://schemas.microsoft.com/office/drawing/2015/10/21/chartex" xmlns:cx3="http://schemas.microsoft.com/office/drawing/2016/5/9/chartex" xmlns:cx4="http://schemas.microsoft.com/office/drawing/2016/5/10/chartex" xmlns:cx5="http://schemas.microsoft.com/office/drawing/2016/5/11/chartex" xmlns:cx6="http://schemas.microsoft.com/office/drawing/2016/5/12/chartex" xmlns:cx7="http://schemas.microsoft.com/office/drawing/2016/5/13/chartex" xmlns:cx8="http://schemas.microsoft.com/office/drawing/2016/5/14/chartex" xmlns:mc="http://schemas.openxmlformats.org/markup-compatibility/2006" xmlns:aink="http://schemas.microsoft.com/office/drawing/2016/ink" xmlns:am3d="http://schemas.microsoft.com/office/drawing/2017/model3d" xmlns:o="urn:schemas-microsoft-com:office:office" xmlns:oel="http://schemas.microsoft.com/office/2019/extlst" xmlns:r="http://schemas.openxmlformats.org/officeDocument/2006/relationships" xmlns:m="http://schemas.openxmlformats.org/officeDocument/2006/math" xmlns:v="urn:schemas-microsoft-com:vml" xmlns:wp14="http://schemas.microsoft.com/office/word/2010/wordprocessingDrawing" xmlns:wp="http://schemas.openxmlformats.org/drawingml/2006/wordprocessingDrawing" xmlns:w10="urn:schemas-microsoft-com:office:word" xmlns:w="http://schemas.openxmlformats.org/wordprocessingml/2006/main" xmlns:w14="http://schemas.microsoft.com/office/word/2010/wordml" xmlns:w15="http://schemas.microsoft.com/office/word/2012/wordml" xmlns:w16cei="http://schemas.microsoft.com/office/word/2026/wordml/cei" xmlns:w16cex="http://schemas.microsoft.com/office/word/2018/wordml/cex" xmlns:w16cid="http://schemas.microsoft.com/office/word/2016/wordml/cid" xmlns:w16="http://schemas.microsoft.com/office/word/2018/wordml" xmlns:w16du="http://schemas.microsoft.com/office/word/2023/wordml/word16du" xmlns:w16sdtdh="http://schemas.microsoft.com/office/word/2020/wordml/sdtdatahash" xmlns:w16sdtfl="http://schemas.microsoft.com/office/word/2024/wordml/sdtformatlock" xmlns:w16se="http://schemas.microsoft.com/office/word/2015/wordml/symex" xmlns:wpg="http://schemas.microsoft.com/office/word/2010/wordprocessingGroup" xmlns:wpi="http://schemas.microsoft.com/office/word/2010/wordprocessingInk" xmlns:wne="http://schemas.microsoft.com/office/word/2006/wordml" xmlns:wps="http://schemas.microsoft.com/office/word/2010/wordprocessingShape" mc:Ignorable="w14 w15 w16se w16cid w16 w16cex w16sdtdh w16sdtfl w16du wp14">
   <w:p>
     <w:pPr>
       <w:pStyle w:val="Footer"/>
@@ -2212,7 +1777,7 @@
 </file>
 
 <file path=word/footnotes.xml><?xml version="1.0" encoding="utf-8"?>
-<w:footnotes xmlns:wpc="http://schemas.microsoft.com/office/word/2010/wordprocessingCanvas" xmlns:cx="http://schemas.microsoft.com/office/drawing/2014/chartex" xmlns:cx1="http://schemas.microsoft.com/office/drawing/2015/9/8/chartex" xmlns:cx2="http://schemas.microsoft.com/office/drawing/2015/10/21/chartex" xmlns:cx3="http://schemas.microsoft.com/office/drawing/2016/5/9/chartex" xmlns:cx4="http://schemas.microsoft.com/office/drawing/2016/5/10/chartex" xmlns:cx5="http://schemas.microsoft.com/office/drawing/2016/5/11/chartex" xmlns:cx6="http://schemas.microsoft.com/office/drawing/2016/5/12/chartex" xmlns:cx7="http://schemas.microsoft.com/office/drawing/2016/5/13/chartex" xmlns:cx8="http://schemas.microsoft.com/office/drawing/2016/5/14/chartex" xmlns:mc="http://schemas.openxmlformats.org/markup-compatibility/2006" xmlns:aink="http://schemas.microsoft.com/office/drawing/2016/ink" xmlns:am3d="http://schemas.microsoft.com/office/drawing/2017/model3d" xmlns:o="urn:schemas-microsoft-com:office:office" xmlns:oel="http://schemas.microsoft.com/office/2019/extlst" xmlns:r="http://schemas.openxmlformats.org/officeDocument/2006/relationships" xmlns:m="http://schemas.openxmlformats.org/officeDocument/2006/math" xmlns:v="urn:schemas-microsoft-com:vml" xmlns:wp14="http://schemas.microsoft.com/office/word/2010/wordprocessingDrawing" xmlns:wp="http://schemas.openxmlformats.org/drawingml/2006/wordprocessingDrawing" xmlns:w10="urn:schemas-microsoft-com:office:word" xmlns:w="http://schemas.openxmlformats.org/wordprocessingml/2006/main" xmlns:w14="http://schemas.microsoft.com/office/word/2010/wordml" xmlns:w15="http://schemas.microsoft.com/office/word/2012/wordml" xmlns:w16cex="http://schemas.microsoft.com/office/word/2018/wordml/cex" xmlns:w16cid="http://schemas.microsoft.com/office/word/2016/wordml/cid" xmlns:w16="http://schemas.microsoft.com/office/word/2018/wordml" xmlns:w16du="http://schemas.microsoft.com/office/word/2023/wordml/word16du" xmlns:w16sdtdh="http://schemas.microsoft.com/office/word/2020/wordml/sdtdatahash" xmlns:w16sdtfl="http://schemas.microsoft.com/office/word/2024/wordml/sdtformatlock" xmlns:w16se="http://schemas.microsoft.com/office/word/2015/wordml/symex" xmlns:wpg="http://schemas.microsoft.com/office/word/2010/wordprocessingGroup" xmlns:wpi="http://schemas.microsoft.com/office/word/2010/wordprocessingInk" xmlns:wne="http://schemas.microsoft.com/office/word/2006/wordml" xmlns:wps="http://schemas.microsoft.com/office/word/2010/wordprocessingShape" mc:Ignorable="w14 w15 w16se w16cid w16 w16cex w16sdtdh w16sdtfl w16du wp14">
+<w:footnotes xmlns:wpc="http://schemas.microsoft.com/office/word/2010/wordprocessingCanvas" xmlns:cx="http://schemas.microsoft.com/office/drawing/2014/chartex" xmlns:cx1="http://schemas.microsoft.com/office/drawing/2015/9/8/chartex" xmlns:cx2="http://schemas.microsoft.com/office/drawing/2015/10/21/chartex" xmlns:cx3="http://schemas.microsoft.com/office/drawing/2016/5/9/chartex" xmlns:cx4="http://schemas.microsoft.com/office/drawing/2016/5/10/chartex" xmlns:cx5="http://schemas.microsoft.com/office/drawing/2016/5/11/chartex" xmlns:cx6="http://schemas.microsoft.com/office/drawing/2016/5/12/chartex" xmlns:cx7="http://schemas.microsoft.com/office/drawing/2016/5/13/chartex" xmlns:cx8="http://schemas.microsoft.com/office/drawing/2016/5/14/chartex" xmlns:mc="http://schemas.openxmlformats.org/markup-compatibility/2006" xmlns:aink="http://schemas.microsoft.com/office/drawing/2016/ink" xmlns:am3d="http://schemas.microsoft.com/office/drawing/2017/model3d" xmlns:o="urn:schemas-microsoft-com:office:office" xmlns:oel="http://schemas.microsoft.com/office/2019/extlst" xmlns:r="http://schemas.openxmlformats.org/officeDocument/2006/relationships" xmlns:m="http://schemas.openxmlformats.org/officeDocument/2006/math" xmlns:v="urn:schemas-microsoft-com:vml" xmlns:wp14="http://schemas.microsoft.com/office/word/2010/wordprocessingDrawing" xmlns:wp="http://schemas.openxmlformats.org/drawingml/2006/wordprocessingDrawing" xmlns:w10="urn:schemas-microsoft-com:office:word" xmlns:w="http://schemas.openxmlformats.org/wordprocessingml/2006/main" xmlns:w14="http://schemas.microsoft.com/office/word/2010/wordml" xmlns:w15="http://schemas.microsoft.com/office/word/2012/wordml" xmlns:w16cei="http://schemas.microsoft.com/office/word/2026/wordml/cei" xmlns:w16cex="http://schemas.microsoft.com/office/word/2018/wordml/cex" xmlns:w16cid="http://schemas.microsoft.com/office/word/2016/wordml/cid" xmlns:w16="http://schemas.microsoft.com/office/word/2018/wordml" xmlns:w16du="http://schemas.microsoft.com/office/word/2023/wordml/word16du" xmlns:w16sdtdh="http://schemas.microsoft.com/office/word/2020/wordml/sdtdatahash" xmlns:w16sdtfl="http://schemas.microsoft.com/office/word/2024/wordml/sdtformatlock" xmlns:w16se="http://schemas.microsoft.com/office/word/2015/wordml/symex" xmlns:wpg="http://schemas.microsoft.com/office/word/2010/wordprocessingGroup" xmlns:wpi="http://schemas.microsoft.com/office/word/2010/wordprocessingInk" xmlns:wne="http://schemas.microsoft.com/office/word/2006/wordml" xmlns:wps="http://schemas.microsoft.com/office/word/2010/wordprocessingShape" mc:Ignorable="w14 w15 w16se w16cid w16 w16cex w16sdtdh w16sdtfl w16du wp14">
   <w:footnote w:type="separator" w:id="-1">
     <w:p>
       <w:r>
@@ -2231,7 +1796,7 @@
 </file>
 
 <file path=word/header1.xml><?xml version="1.0" encoding="utf-8"?>
-<w:hdr xmlns:wpc="http://schemas.microsoft.com/office/word/2010/wordprocessingCanvas" xmlns:cx="http://schemas.microsoft.com/office/drawing/2014/chartex" xmlns:cx1="http://schemas.microsoft.com/office/drawing/2015/9/8/chartex" xmlns:cx2="http://schemas.microsoft.com/office/drawing/2015/10/21/chartex" xmlns:cx3="http://schemas.microsoft.com/office/drawing/2016/5/9/chartex" xmlns:cx4="http://schemas.microsoft.com/office/drawing/2016/5/10/chartex" xmlns:cx5="http://schemas.microsoft.com/office/drawing/2016/5/11/chartex" xmlns:cx6="http://schemas.microsoft.com/office/drawing/2016/5/12/chartex" xmlns:cx7="http://schemas.microsoft.com/office/drawing/2016/5/13/chartex" xmlns:cx8="http://schemas.microsoft.com/office/drawing/2016/5/14/chartex" xmlns:mc="http://schemas.openxmlformats.org/markup-compatibility/2006" xmlns:aink="http://schemas.microsoft.com/office/drawing/2016/ink" xmlns:am3d="http://schemas.microsoft.com/office/drawing/2017/model3d" xmlns:o="urn:schemas-microsoft-com:office:office" xmlns:oel="http://schemas.microsoft.com/office/2019/extlst" xmlns:r="http://schemas.openxmlformats.org/officeDocument/2006/relationships" xmlns:m="http://schemas.openxmlformats.org/officeDocument/2006/math" xmlns:v="urn:schemas-microsoft-com:vml" xmlns:wp14="http://schemas.microsoft.com/office/word/2010/wordprocessingDrawing" xmlns:wp="http://schemas.openxmlformats.org/drawingml/2006/wordprocessingDrawing" xmlns:w10="urn:schemas-microsoft-com:office:word" xmlns:w="http://schemas.openxmlformats.org/wordprocessingml/2006/main" xmlns:w14="http://schemas.microsoft.com/office/word/2010/wordml" xmlns:w15="http://schemas.microsoft.com/office/word/2012/wordml" xmlns:w16cex="http://schemas.microsoft.com/office/word/2018/wordml/cex" xmlns:w16cid="http://schemas.microsoft.com/office/word/2016/wordml/cid" xmlns:w16="http://schemas.microsoft.com/office/word/2018/wordml" xmlns:w16du="http://schemas.microsoft.com/office/word/2023/wordml/word16du" xmlns:w16sdtdh="http://schemas.microsoft.com/office/word/2020/wordml/sdtdatahash" xmlns:w16sdtfl="http://schemas.microsoft.com/office/word/2024/wordml/sdtformatlock" xmlns:w16se="http://schemas.microsoft.com/office/word/2015/wordml/symex" xmlns:wpg="http://schemas.microsoft.com/office/word/2010/wordprocessingGroup" xmlns:wpi="http://schemas.microsoft.com/office/word/2010/wordprocessingInk" xmlns:wne="http://schemas.microsoft.com/office/word/2006/wordml" xmlns:wps="http://schemas.microsoft.com/office/word/2010/wordprocessingShape" mc:Ignorable="w14 w15 w16se w16cid w16 w16cex w16sdtdh w16sdtfl w16du wp14">
+<w:hdr xmlns:wpc="http://schemas.microsoft.com/office/word/2010/wordprocessingCanvas" xmlns:cx="http://schemas.microsoft.com/office/drawing/2014/chartex" xmlns:cx1="http://schemas.microsoft.com/office/drawing/2015/9/8/chartex" xmlns:cx2="http://schemas.microsoft.com/office/drawing/2015/10/21/chartex" xmlns:cx3="http://schemas.microsoft.com/office/drawing/2016/5/9/chartex" xmlns:cx4="http://schemas.microsoft.com/office/drawing/2016/5/10/chartex" xmlns:cx5="http://schemas.microsoft.com/office/drawing/2016/5/11/chartex" xmlns:cx6="http://schemas.microsoft.com/office/drawing/2016/5/12/chartex" xmlns:cx7="http://schemas.microsoft.com/office/drawing/2016/5/13/chartex" xmlns:cx8="http://schemas.microsoft.com/office/drawing/2016/5/14/chartex" xmlns:mc="http://schemas.openxmlformats.org/markup-compatibility/2006" xmlns:aink="http://schemas.microsoft.com/office/drawing/2016/ink" xmlns:am3d="http://schemas.microsoft.com/office/drawing/2017/model3d" xmlns:o="urn:schemas-microsoft-com:office:office" xmlns:oel="http://schemas.microsoft.com/office/2019/extlst" xmlns:r="http://schemas.openxmlformats.org/officeDocument/2006/relationships" xmlns:m="http://schemas.openxmlformats.org/officeDocument/2006/math" xmlns:v="urn:schemas-microsoft-com:vml" xmlns:wp14="http://schemas.microsoft.com/office/word/2010/wordprocessingDrawing" xmlns:wp="http://schemas.openxmlformats.org/drawingml/2006/wordprocessingDrawing" xmlns:w10="urn:schemas-microsoft-com:office:word" xmlns:w="http://schemas.openxmlformats.org/wordprocessingml/2006/main" xmlns:w14="http://schemas.microsoft.com/office/word/2010/wordml" xmlns:w15="http://schemas.microsoft.com/office/word/2012/wordml" xmlns:w16cei="http://schemas.microsoft.com/office/word/2026/wordml/cei" xmlns:w16cex="http://schemas.microsoft.com/office/word/2018/wordml/cex" xmlns:w16cid="http://schemas.microsoft.com/office/word/2016/wordml/cid" xmlns:w16="http://schemas.microsoft.com/office/word/2018/wordml" xmlns:w16du="http://schemas.microsoft.com/office/word/2023/wordml/word16du" xmlns:w16sdtdh="http://schemas.microsoft.com/office/word/2020/wordml/sdtdatahash" xmlns:w16sdtfl="http://schemas.microsoft.com/office/word/2024/wordml/sdtformatlock" xmlns:w16se="http://schemas.microsoft.com/office/word/2015/wordml/symex" xmlns:wpg="http://schemas.microsoft.com/office/word/2010/wordprocessingGroup" xmlns:wpi="http://schemas.microsoft.com/office/word/2010/wordprocessingInk" xmlns:wne="http://schemas.microsoft.com/office/word/2006/wordml" xmlns:wps="http://schemas.microsoft.com/office/word/2010/wordprocessingShape" mc:Ignorable="w14 w15 w16se w16cid w16 w16cex w16sdtdh w16sdtfl w16du wp14">
   <w:p>
     <w:pPr>
       <w:pStyle w:val="Header"/>
@@ -2263,7 +1828,7 @@
 </file>
 
 <file path=word/numbering.xml><?xml version="1.0" encoding="utf-8"?>
-<w:numbering xmlns:wpc="http://schemas.microsoft.com/office/word/2010/wordprocessingCanvas" xmlns:cx="http://schemas.microsoft.com/office/drawing/2014/chartex" xmlns:cx1="http://schemas.microsoft.com/office/drawing/2015/9/8/chartex" xmlns:cx2="http://schemas.microsoft.com/office/drawing/2015/10/21/chartex" xmlns:cx3="http://schemas.microsoft.com/office/drawing/2016/5/9/chartex" xmlns:cx4="http://schemas.microsoft.com/office/drawing/2016/5/10/chartex" xmlns:cx5="http://schemas.microsoft.com/office/drawing/2016/5/11/chartex" xmlns:cx6="http://schemas.microsoft.com/office/drawing/2016/5/12/chartex" xmlns:cx7="http://schemas.microsoft.com/office/drawing/2016/5/13/chartex" xmlns:cx8="http://schemas.microsoft.com/office/drawing/2016/5/14/chartex" xmlns:mc="http://schemas.openxmlformats.org/markup-compatibility/2006" xmlns:aink="http://schemas.microsoft.com/office/drawing/2016/ink" xmlns:am3d="http://schemas.microsoft.com/office/drawing/2017/model3d" xmlns:o="urn:schemas-microsoft-com:office:office" xmlns:oel="http://schemas.microsoft.com/office/2019/extlst" xmlns:r="http://schemas.openxmlformats.org/officeDocument/2006/relationships" xmlns:m="http://schemas.openxmlformats.org/officeDocument/2006/math" xmlns:v="urn:schemas-microsoft-com:vml" xmlns:wp14="http://schemas.microsoft.com/office/word/2010/wordprocessingDrawing" xmlns:wp="http://schemas.openxmlformats.org/drawingml/2006/wordprocessingDrawing" xmlns:w10="urn:schemas-microsoft-com:office:word" xmlns:w="http://schemas.openxmlformats.org/wordprocessingml/2006/main" xmlns:w14="http://schemas.microsoft.com/office/word/2010/wordml" xmlns:w15="http://schemas.microsoft.com/office/word/2012/wordml" xmlns:w16cex="http://schemas.microsoft.com/office/word/2018/wordml/cex" xmlns:w16cid="http://schemas.microsoft.com/office/word/2016/wordml/cid" xmlns:w16="http://schemas.microsoft.com/office/word/2018/wordml" xmlns:w16du="http://schemas.microsoft.com/office/word/2023/wordml/word16du" xmlns:w16sdtdh="http://schemas.microsoft.com/office/word/2020/wordml/sdtdatahash" xmlns:w16sdtfl="http://schemas.microsoft.com/office/word/2024/wordml/sdtformatlock" xmlns:w16se="http://schemas.microsoft.com/office/word/2015/wordml/symex" xmlns:wpg="http://schemas.microsoft.com/office/word/2010/wordprocessingGroup" xmlns:wpi="http://schemas.microsoft.com/office/word/2010/wordprocessingInk" xmlns:wne="http://schemas.microsoft.com/office/word/2006/wordml" xmlns:wps="http://schemas.microsoft.com/office/word/2010/wordprocessingShape" mc:Ignorable="w14 w15 w16se w16cid w16 w16cex w16sdtdh w16sdtfl w16du wp14">
+<w:numbering xmlns:wpc="http://schemas.microsoft.com/office/word/2010/wordprocessingCanvas" xmlns:cx="http://schemas.microsoft.com/office/drawing/2014/chartex" xmlns:cx1="http://schemas.microsoft.com/office/drawing/2015/9/8/chartex" xmlns:cx2="http://schemas.microsoft.com/office/drawing/2015/10/21/chartex" xmlns:cx3="http://schemas.microsoft.com/office/drawing/2016/5/9/chartex" xmlns:cx4="http://schemas.microsoft.com/office/drawing/2016/5/10/chartex" xmlns:cx5="http://schemas.microsoft.com/office/drawing/2016/5/11/chartex" xmlns:cx6="http://schemas.microsoft.com/office/drawing/2016/5/12/chartex" xmlns:cx7="http://schemas.microsoft.com/office/drawing/2016/5/13/chartex" xmlns:cx8="http://schemas.microsoft.com/office/drawing/2016/5/14/chartex" xmlns:mc="http://schemas.openxmlformats.org/markup-compatibility/2006" xmlns:aink="http://schemas.microsoft.com/office/drawing/2016/ink" xmlns:am3d="http://schemas.microsoft.com/office/drawing/2017/model3d" xmlns:o="urn:schemas-microsoft-com:office:office" xmlns:oel="http://schemas.microsoft.com/office/2019/extlst" xmlns:r="http://schemas.openxmlformats.org/officeDocument/2006/relationships" xmlns:m="http://schemas.openxmlformats.org/officeDocument/2006/math" xmlns:v="urn:schemas-microsoft-com:vml" xmlns:wp14="http://schemas.microsoft.com/office/word/2010/wordprocessingDrawing" xmlns:wp="http://schemas.openxmlformats.org/drawingml/2006/wordprocessingDrawing" xmlns:w10="urn:schemas-microsoft-com:office:word" xmlns:w="http://schemas.openxmlformats.org/wordprocessingml/2006/main" xmlns:w14="http://schemas.microsoft.com/office/word/2010/wordml" xmlns:w15="http://schemas.microsoft.com/office/word/2012/wordml" xmlns:w16cei="http://schemas.microsoft.com/office/word/2026/wordml/cei" xmlns:w16cex="http://schemas.microsoft.com/office/word/2018/wordml/cex" xmlns:w16cid="http://schemas.microsoft.com/office/word/2016/wordml/cid" xmlns:w16="http://schemas.microsoft.com/office/word/2018/wordml" xmlns:w16du="http://schemas.microsoft.com/office/word/2023/wordml/word16du" xmlns:w16sdtdh="http://schemas.microsoft.com/office/word/2020/wordml/sdtdatahash" xmlns:w16sdtfl="http://schemas.microsoft.com/office/word/2024/wordml/sdtformatlock" xmlns:w16se="http://schemas.microsoft.com/office/word/2015/wordml/symex" xmlns:wpg="http://schemas.microsoft.com/office/word/2010/wordprocessingGroup" xmlns:wpi="http://schemas.microsoft.com/office/word/2010/wordprocessingInk" xmlns:wne="http://schemas.microsoft.com/office/word/2006/wordml" xmlns:wps="http://schemas.microsoft.com/office/word/2010/wordprocessingShape" mc:Ignorable="w14 w15 w16se w16cid w16 w16cex w16sdtdh w16sdtfl w16du wp14">
   <w:abstractNum w:abstractNumId="0" w15:restartNumberingAfterBreak="0">
     <w:nsid w:val="27F0573B"/>
     <w:multiLevelType w:val="singleLevel"/>

</xml_diff>